<commit_message>
TS 5.3 Kramam Tamil  corrections
</commit_message>
<xml_diff>
--- a/TS-Kramam/TS-5.3/TS 5.3 Sanskrit Krama Paatam Corrections.docx
+++ b/TS-Kramam/TS-5.3/TS 5.3 Sanskrit Krama Paatam Corrections.docx
@@ -81,7 +81,18 @@
           <w:szCs w:val="32"/>
           <w:u w:val="single"/>
         </w:rPr>
-        <w:t xml:space="preserve">Observed till </w:t>
+        <w:t xml:space="preserve">Observed </w:t>
+      </w:r>
+      <w:proofErr w:type="gramStart"/>
+      <w:r>
+        <w:rPr>
+          <w:b/>
+          <w:bCs/>
+          <w:sz w:val="32"/>
+          <w:szCs w:val="32"/>
+          <w:u w:val="single"/>
+        </w:rPr>
+        <w:t xml:space="preserve">till </w:t>
       </w:r>
       <w:r>
         <w:rPr>
@@ -94,6 +105,7 @@
         </w:rPr>
         <w:t>???</w:t>
       </w:r>
+      <w:proofErr w:type="gramEnd"/>
     </w:p>
     <w:p>
       <w:pPr>
@@ -373,6 +385,7 @@
                 <w:lang w:bidi="ml-IN"/>
               </w:rPr>
             </w:pPr>
+            <w:proofErr w:type="spellStart"/>
             <w:r>
               <w:rPr>
                 <w:rFonts w:ascii="BRH Devanagari Extra" w:hAnsi="BRH Devanagari Extra" w:cs="BRH Devanagari Extra"/>
@@ -383,25 +396,48 @@
               </w:rPr>
               <w:t>ClSìÉÿalÉÏ</w:t>
             </w:r>
-            <w:r>
-              <w:rPr>
-                <w:rFonts w:ascii="BRH Malayalam Extra" w:hAnsi="BRH Malayalam Extra" w:cs="BRH Devanagari Extra"/>
-                <w:color w:val="000000"/>
-                <w:sz w:val="32"/>
-                <w:szCs w:val="40"/>
-                <w:lang w:bidi="ml-IN"/>
-              </w:rPr>
-              <w:t>–</w:t>
-            </w:r>
-            <w:r>
-              <w:rPr>
-                <w:rFonts w:ascii="BRH Devanagari Extra" w:hAnsi="BRH Devanagari Extra" w:cs="BRH Devanagari Extra"/>
-                <w:color w:val="000000"/>
-                <w:sz w:val="40"/>
-                <w:szCs w:val="40"/>
-                <w:lang w:bidi="ml-IN"/>
-              </w:rPr>
-              <w:t xml:space="preserve"> AurÉþjÉqÉÉlÉÉqÉç | </w:t>
+            <w:proofErr w:type="spellEnd"/>
+            <w:r>
+              <w:rPr>
+                <w:rFonts w:ascii="BRH Malayalam Extra" w:hAnsi="BRH Malayalam Extra" w:cs="BRH Devanagari Extra"/>
+                <w:color w:val="000000"/>
+                <w:sz w:val="32"/>
+                <w:szCs w:val="40"/>
+                <w:lang w:bidi="ml-IN"/>
+              </w:rPr>
+              <w:t>–</w:t>
+            </w:r>
+            <w:r>
+              <w:rPr>
+                <w:rFonts w:ascii="BRH Devanagari Extra" w:hAnsi="BRH Devanagari Extra" w:cs="BRH Devanagari Extra"/>
+                <w:color w:val="000000"/>
+                <w:sz w:val="40"/>
+                <w:szCs w:val="40"/>
+                <w:lang w:bidi="ml-IN"/>
+              </w:rPr>
+              <w:t xml:space="preserve"> </w:t>
+            </w:r>
+            <w:proofErr w:type="spellStart"/>
+            <w:r>
+              <w:rPr>
+                <w:rFonts w:ascii="BRH Devanagari Extra" w:hAnsi="BRH Devanagari Extra" w:cs="BRH Devanagari Extra"/>
+                <w:color w:val="000000"/>
+                <w:sz w:val="40"/>
+                <w:szCs w:val="40"/>
+                <w:lang w:bidi="ml-IN"/>
+              </w:rPr>
+              <w:t>AurÉþjÉqÉÉlÉÉqÉç</w:t>
+            </w:r>
+            <w:proofErr w:type="spellEnd"/>
+            <w:r>
+              <w:rPr>
+                <w:rFonts w:ascii="BRH Devanagari Extra" w:hAnsi="BRH Devanagari Extra" w:cs="BRH Devanagari Extra"/>
+                <w:color w:val="000000"/>
+                <w:sz w:val="40"/>
+                <w:szCs w:val="40"/>
+                <w:lang w:bidi="ml-IN"/>
+              </w:rPr>
+              <w:t xml:space="preserve"> | </w:t>
             </w:r>
           </w:p>
           <w:p>
@@ -418,6 +454,7 @@
                 <w:szCs w:val="40"/>
               </w:rPr>
             </w:pPr>
+            <w:proofErr w:type="spellStart"/>
             <w:r>
               <w:rPr>
                 <w:rFonts w:ascii="BRH Devanagari Extra" w:hAnsi="BRH Devanagari Extra" w:cs="BRH Devanagari Extra"/>
@@ -449,36 +486,60 @@
               </w:rPr>
               <w:t>þalÉÏ</w:t>
             </w:r>
-            <w:r>
-              <w:rPr>
-                <w:rFonts w:ascii="BRH Malayalam Extra" w:hAnsi="BRH Malayalam Extra" w:cs="BRH Devanagari Extra"/>
-                <w:color w:val="000000"/>
-                <w:sz w:val="32"/>
-                <w:szCs w:val="40"/>
-                <w:lang w:bidi="ml-IN"/>
-              </w:rPr>
-              <w:t>–</w:t>
-            </w:r>
-            <w:r>
-              <w:rPr>
-                <w:rFonts w:ascii="BRH Devanagari Extra" w:hAnsi="BRH Devanagari Extra" w:cs="BRH Devanagari Extra"/>
-                <w:color w:val="000000"/>
-                <w:sz w:val="40"/>
-                <w:szCs w:val="40"/>
-                <w:lang w:bidi="ml-IN"/>
-              </w:rPr>
-              <w:t xml:space="preserve"> CiÉÏlSìþ - A</w:t>
-            </w:r>
-            <w:r>
-              <w:rPr>
-                <w:rFonts w:ascii="BRH Malayalam Extra" w:hAnsi="BRH Malayalam Extra" w:cs="BRH Devanagari Extra"/>
-                <w:color w:val="000000"/>
-                <w:sz w:val="32"/>
-                <w:szCs w:val="40"/>
-                <w:lang w:bidi="ml-IN"/>
-              </w:rPr>
-              <w:t>–</w:t>
-            </w:r>
+            <w:proofErr w:type="spellEnd"/>
+            <w:r>
+              <w:rPr>
+                <w:rFonts w:ascii="BRH Malayalam Extra" w:hAnsi="BRH Malayalam Extra" w:cs="BRH Devanagari Extra"/>
+                <w:color w:val="000000"/>
+                <w:sz w:val="32"/>
+                <w:szCs w:val="40"/>
+                <w:lang w:bidi="ml-IN"/>
+              </w:rPr>
+              <w:t>–</w:t>
+            </w:r>
+            <w:r>
+              <w:rPr>
+                <w:rFonts w:ascii="BRH Devanagari Extra" w:hAnsi="BRH Devanagari Extra" w:cs="BRH Devanagari Extra"/>
+                <w:color w:val="000000"/>
+                <w:sz w:val="40"/>
+                <w:szCs w:val="40"/>
+                <w:lang w:bidi="ml-IN"/>
+              </w:rPr>
+              <w:t xml:space="preserve"> </w:t>
+            </w:r>
+            <w:proofErr w:type="spellStart"/>
+            <w:r>
+              <w:rPr>
+                <w:rFonts w:ascii="BRH Devanagari Extra" w:hAnsi="BRH Devanagari Extra" w:cs="BRH Devanagari Extra"/>
+                <w:color w:val="000000"/>
+                <w:sz w:val="40"/>
+                <w:szCs w:val="40"/>
+                <w:lang w:bidi="ml-IN"/>
+              </w:rPr>
+              <w:t>CiÉÏlSìþ</w:t>
+            </w:r>
+            <w:proofErr w:type="spellEnd"/>
+            <w:r>
+              <w:rPr>
+                <w:rFonts w:ascii="BRH Devanagari Extra" w:hAnsi="BRH Devanagari Extra" w:cs="BRH Devanagari Extra"/>
+                <w:color w:val="000000"/>
+                <w:sz w:val="40"/>
+                <w:szCs w:val="40"/>
+                <w:lang w:bidi="ml-IN"/>
+              </w:rPr>
+              <w:t xml:space="preserve"> - A</w:t>
+            </w:r>
+            <w:r>
+              <w:rPr>
+                <w:rFonts w:ascii="BRH Malayalam Extra" w:hAnsi="BRH Malayalam Extra" w:cs="BRH Devanagari Extra"/>
+                <w:color w:val="000000"/>
+                <w:sz w:val="32"/>
+                <w:szCs w:val="40"/>
+                <w:lang w:bidi="ml-IN"/>
+              </w:rPr>
+              <w:t>–</w:t>
+            </w:r>
+            <w:proofErr w:type="spellStart"/>
             <w:r>
               <w:rPr>
                 <w:rFonts w:ascii="BRH Devanagari Extra" w:hAnsi="BRH Devanagari Extra" w:cs="BRH Devanagari Extra"/>
@@ -489,6 +550,7 @@
               </w:rPr>
               <w:t>alÉÏ</w:t>
             </w:r>
+            <w:proofErr w:type="spellEnd"/>
             <w:r>
               <w:rPr>
                 <w:rFonts w:ascii="BRH Malayalam Extra" w:hAnsi="BRH Malayalam Extra" w:cs="BRH Devanagari Extra"/>
@@ -530,6 +592,7 @@
                 <w:lang w:bidi="ml-IN"/>
               </w:rPr>
             </w:pPr>
+            <w:proofErr w:type="spellStart"/>
             <w:r>
               <w:rPr>
                 <w:rFonts w:ascii="BRH Devanagari Extra" w:hAnsi="BRH Devanagari Extra" w:cs="BRH Devanagari Extra"/>
@@ -540,25 +603,48 @@
               </w:rPr>
               <w:t>ClSìÉÿalÉÏ</w:t>
             </w:r>
-            <w:r>
-              <w:rPr>
-                <w:rFonts w:ascii="BRH Malayalam Extra" w:hAnsi="BRH Malayalam Extra" w:cs="BRH Devanagari Extra"/>
-                <w:color w:val="000000"/>
-                <w:sz w:val="32"/>
-                <w:szCs w:val="40"/>
-                <w:lang w:bidi="ml-IN"/>
-              </w:rPr>
-              <w:t>–</w:t>
-            </w:r>
-            <w:r>
-              <w:rPr>
-                <w:rFonts w:ascii="BRH Devanagari Extra" w:hAnsi="BRH Devanagari Extra" w:cs="BRH Devanagari Extra"/>
-                <w:color w:val="000000"/>
-                <w:sz w:val="40"/>
-                <w:szCs w:val="40"/>
-                <w:lang w:bidi="ml-IN"/>
-              </w:rPr>
-              <w:t xml:space="preserve"> AurÉþjÉqÉÉlÉÉqÉç | </w:t>
+            <w:proofErr w:type="spellEnd"/>
+            <w:r>
+              <w:rPr>
+                <w:rFonts w:ascii="BRH Malayalam Extra" w:hAnsi="BRH Malayalam Extra" w:cs="BRH Devanagari Extra"/>
+                <w:color w:val="000000"/>
+                <w:sz w:val="32"/>
+                <w:szCs w:val="40"/>
+                <w:lang w:bidi="ml-IN"/>
+              </w:rPr>
+              <w:t>–</w:t>
+            </w:r>
+            <w:r>
+              <w:rPr>
+                <w:rFonts w:ascii="BRH Devanagari Extra" w:hAnsi="BRH Devanagari Extra" w:cs="BRH Devanagari Extra"/>
+                <w:color w:val="000000"/>
+                <w:sz w:val="40"/>
+                <w:szCs w:val="40"/>
+                <w:lang w:bidi="ml-IN"/>
+              </w:rPr>
+              <w:t xml:space="preserve"> </w:t>
+            </w:r>
+            <w:proofErr w:type="spellStart"/>
+            <w:r>
+              <w:rPr>
+                <w:rFonts w:ascii="BRH Devanagari Extra" w:hAnsi="BRH Devanagari Extra" w:cs="BRH Devanagari Extra"/>
+                <w:color w:val="000000"/>
+                <w:sz w:val="40"/>
+                <w:szCs w:val="40"/>
+                <w:lang w:bidi="ml-IN"/>
+              </w:rPr>
+              <w:t>AurÉþjÉqÉÉlÉÉqÉç</w:t>
+            </w:r>
+            <w:proofErr w:type="spellEnd"/>
+            <w:r>
+              <w:rPr>
+                <w:rFonts w:ascii="BRH Devanagari Extra" w:hAnsi="BRH Devanagari Extra" w:cs="BRH Devanagari Extra"/>
+                <w:color w:val="000000"/>
+                <w:sz w:val="40"/>
+                <w:szCs w:val="40"/>
+                <w:lang w:bidi="ml-IN"/>
+              </w:rPr>
+              <w:t xml:space="preserve"> | </w:t>
             </w:r>
           </w:p>
           <w:p>
@@ -575,6 +661,7 @@
                 <w:szCs w:val="40"/>
               </w:rPr>
             </w:pPr>
+            <w:proofErr w:type="spellStart"/>
             <w:r>
               <w:rPr>
                 <w:rFonts w:ascii="BRH Devanagari Extra" w:hAnsi="BRH Devanagari Extra" w:cs="BRH Devanagari Extra"/>
@@ -606,36 +693,60 @@
               </w:rPr>
               <w:t>alÉÏ</w:t>
             </w:r>
-            <w:r>
-              <w:rPr>
-                <w:rFonts w:ascii="BRH Malayalam Extra" w:hAnsi="BRH Malayalam Extra" w:cs="BRH Devanagari Extra"/>
-                <w:color w:val="000000"/>
-                <w:sz w:val="32"/>
-                <w:szCs w:val="40"/>
-                <w:lang w:bidi="ml-IN"/>
-              </w:rPr>
-              <w:t>–</w:t>
-            </w:r>
-            <w:r>
-              <w:rPr>
-                <w:rFonts w:ascii="BRH Devanagari Extra" w:hAnsi="BRH Devanagari Extra" w:cs="BRH Devanagari Extra"/>
-                <w:color w:val="000000"/>
-                <w:sz w:val="40"/>
-                <w:szCs w:val="40"/>
-                <w:lang w:bidi="ml-IN"/>
-              </w:rPr>
-              <w:t xml:space="preserve"> CiÉÏlSìþ - A</w:t>
-            </w:r>
-            <w:r>
-              <w:rPr>
-                <w:rFonts w:ascii="BRH Malayalam Extra" w:hAnsi="BRH Malayalam Extra" w:cs="BRH Devanagari Extra"/>
-                <w:color w:val="000000"/>
-                <w:sz w:val="32"/>
-                <w:szCs w:val="40"/>
-                <w:lang w:bidi="ml-IN"/>
-              </w:rPr>
-              <w:t>–</w:t>
-            </w:r>
+            <w:proofErr w:type="spellEnd"/>
+            <w:r>
+              <w:rPr>
+                <w:rFonts w:ascii="BRH Malayalam Extra" w:hAnsi="BRH Malayalam Extra" w:cs="BRH Devanagari Extra"/>
+                <w:color w:val="000000"/>
+                <w:sz w:val="32"/>
+                <w:szCs w:val="40"/>
+                <w:lang w:bidi="ml-IN"/>
+              </w:rPr>
+              <w:t>–</w:t>
+            </w:r>
+            <w:r>
+              <w:rPr>
+                <w:rFonts w:ascii="BRH Devanagari Extra" w:hAnsi="BRH Devanagari Extra" w:cs="BRH Devanagari Extra"/>
+                <w:color w:val="000000"/>
+                <w:sz w:val="40"/>
+                <w:szCs w:val="40"/>
+                <w:lang w:bidi="ml-IN"/>
+              </w:rPr>
+              <w:t xml:space="preserve"> </w:t>
+            </w:r>
+            <w:proofErr w:type="spellStart"/>
+            <w:r>
+              <w:rPr>
+                <w:rFonts w:ascii="BRH Devanagari Extra" w:hAnsi="BRH Devanagari Extra" w:cs="BRH Devanagari Extra"/>
+                <w:color w:val="000000"/>
+                <w:sz w:val="40"/>
+                <w:szCs w:val="40"/>
+                <w:lang w:bidi="ml-IN"/>
+              </w:rPr>
+              <w:t>CiÉÏlSìþ</w:t>
+            </w:r>
+            <w:proofErr w:type="spellEnd"/>
+            <w:r>
+              <w:rPr>
+                <w:rFonts w:ascii="BRH Devanagari Extra" w:hAnsi="BRH Devanagari Extra" w:cs="BRH Devanagari Extra"/>
+                <w:color w:val="000000"/>
+                <w:sz w:val="40"/>
+                <w:szCs w:val="40"/>
+                <w:lang w:bidi="ml-IN"/>
+              </w:rPr>
+              <w:t xml:space="preserve"> - A</w:t>
+            </w:r>
+            <w:r>
+              <w:rPr>
+                <w:rFonts w:ascii="BRH Malayalam Extra" w:hAnsi="BRH Malayalam Extra" w:cs="BRH Devanagari Extra"/>
+                <w:color w:val="000000"/>
+                <w:sz w:val="32"/>
+                <w:szCs w:val="40"/>
+                <w:lang w:bidi="ml-IN"/>
+              </w:rPr>
+              <w:t>–</w:t>
+            </w:r>
+            <w:proofErr w:type="spellStart"/>
             <w:r>
               <w:rPr>
                 <w:rFonts w:ascii="BRH Devanagari Extra" w:hAnsi="BRH Devanagari Extra" w:cs="BRH Devanagari Extra"/>
@@ -646,6 +757,7 @@
               </w:rPr>
               <w:t>alÉÏ</w:t>
             </w:r>
+            <w:proofErr w:type="spellEnd"/>
             <w:r>
               <w:rPr>
                 <w:rFonts w:ascii="BRH Malayalam Extra" w:hAnsi="BRH Malayalam Extra" w:cs="BRH Devanagari Extra"/>
@@ -2800,12 +2912,16 @@
               <w:spacing w:before="0" w:line="240" w:lineRule="auto"/>
               <w:jc w:val="center"/>
               <w:rPr>
-                <w:sz w:val="32"/>
-                <w:szCs w:val="32"/>
-              </w:rPr>
-            </w:pPr>
-            <w:r>
-              <w:rPr>
+                <w:b/>
+                <w:bCs/>
+                <w:sz w:val="32"/>
+                <w:szCs w:val="32"/>
+              </w:rPr>
+            </w:pPr>
+            <w:r>
+              <w:rPr>
+                <w:b/>
+                <w:bCs/>
                 <w:sz w:val="32"/>
                 <w:szCs w:val="32"/>
               </w:rPr>
@@ -2817,12 +2933,16 @@
               <w:spacing w:before="0" w:line="240" w:lineRule="auto"/>
               <w:jc w:val="center"/>
               <w:rPr>
-                <w:sz w:val="32"/>
-                <w:szCs w:val="32"/>
-              </w:rPr>
-            </w:pPr>
-            <w:r>
-              <w:rPr>
+                <w:b/>
+                <w:bCs/>
+                <w:sz w:val="32"/>
+                <w:szCs w:val="32"/>
+              </w:rPr>
+            </w:pPr>
+            <w:r>
+              <w:rPr>
+                <w:b/>
+                <w:bCs/>
                 <w:sz w:val="32"/>
                 <w:szCs w:val="32"/>
               </w:rPr>
@@ -2839,12 +2959,16 @@
               <w:spacing w:before="0" w:line="240" w:lineRule="auto"/>
               <w:jc w:val="center"/>
               <w:rPr>
-                <w:sz w:val="32"/>
-                <w:szCs w:val="32"/>
-              </w:rPr>
-            </w:pPr>
-            <w:r>
-              <w:rPr>
+                <w:b/>
+                <w:bCs/>
+                <w:sz w:val="32"/>
+                <w:szCs w:val="32"/>
+              </w:rPr>
+            </w:pPr>
+            <w:r>
+              <w:rPr>
+                <w:b/>
+                <w:bCs/>
                 <w:sz w:val="32"/>
                 <w:szCs w:val="32"/>
               </w:rPr>
@@ -2862,12 +2986,16 @@
               <w:ind w:right="-18"/>
               <w:jc w:val="center"/>
               <w:rPr>
-                <w:sz w:val="32"/>
-                <w:szCs w:val="32"/>
-              </w:rPr>
-            </w:pPr>
-            <w:r>
-              <w:rPr>
+                <w:b/>
+                <w:bCs/>
+                <w:sz w:val="32"/>
+                <w:szCs w:val="32"/>
+              </w:rPr>
+            </w:pPr>
+            <w:r>
+              <w:rPr>
+                <w:b/>
+                <w:bCs/>
                 <w:sz w:val="32"/>
                 <w:szCs w:val="32"/>
               </w:rPr>
@@ -3037,16 +3165,29 @@
                 <w:lang w:bidi="ml-IN"/>
               </w:rPr>
             </w:pPr>
-            <w:r>
-              <w:rPr>
-                <w:rFonts w:ascii="BRH Devanagari Extra" w:hAnsi="BRH Devanagari Extra" w:cs="BRH Devanagari Extra"/>
-                <w:color w:val="000000"/>
-                <w:sz w:val="40"/>
-                <w:szCs w:val="40"/>
-                <w:lang w:bidi="ml-IN"/>
-              </w:rPr>
-              <w:t xml:space="preserve">uÉæ </w:t>
-            </w:r>
+            <w:proofErr w:type="spellStart"/>
+            <w:r>
+              <w:rPr>
+                <w:rFonts w:ascii="BRH Devanagari Extra" w:hAnsi="BRH Devanagari Extra" w:cs="BRH Devanagari Extra"/>
+                <w:color w:val="000000"/>
+                <w:sz w:val="40"/>
+                <w:szCs w:val="40"/>
+                <w:lang w:bidi="ml-IN"/>
+              </w:rPr>
+              <w:t>uÉæ</w:t>
+            </w:r>
+            <w:proofErr w:type="spellEnd"/>
+            <w:r>
+              <w:rPr>
+                <w:rFonts w:ascii="BRH Devanagari Extra" w:hAnsi="BRH Devanagari Extra" w:cs="BRH Devanagari Extra"/>
+                <w:color w:val="000000"/>
+                <w:sz w:val="40"/>
+                <w:szCs w:val="40"/>
+                <w:lang w:bidi="ml-IN"/>
+              </w:rPr>
+              <w:t xml:space="preserve"> </w:t>
+            </w:r>
+            <w:proofErr w:type="spellStart"/>
             <w:r>
               <w:rPr>
                 <w:rFonts w:ascii="BRH Devanagari Extra" w:hAnsi="BRH Devanagari Extra" w:cs="BRH Devanagari Extra"/>
@@ -3058,26 +3199,40 @@
               </w:rPr>
               <w:t>ÌiÉ</w:t>
             </w:r>
-            <w:r>
-              <w:rPr>
-                <w:rFonts w:ascii="BRH Malayalam Extra" w:hAnsi="BRH Malayalam Extra" w:cs="BRH Devanagari Extra"/>
-                <w:color w:val="000000"/>
-                <w:sz w:val="32"/>
-                <w:szCs w:val="40"/>
-                <w:lang w:bidi="ml-IN"/>
-              </w:rPr>
-              <w:t>–</w:t>
-            </w:r>
-            <w:r>
-              <w:rPr>
-                <w:rFonts w:ascii="BRH Devanagari Extra" w:hAnsi="BRH Devanagari Extra" w:cs="BRH Devanagari Extra"/>
-                <w:color w:val="000000"/>
-                <w:sz w:val="40"/>
-                <w:szCs w:val="40"/>
-                <w:lang w:bidi="ml-IN"/>
-              </w:rPr>
-              <w:t xml:space="preserve">uÉ×iÉç | </w:t>
-            </w:r>
+            <w:proofErr w:type="spellEnd"/>
+            <w:r>
+              <w:rPr>
+                <w:rFonts w:ascii="BRH Malayalam Extra" w:hAnsi="BRH Malayalam Extra" w:cs="BRH Devanagari Extra"/>
+                <w:color w:val="000000"/>
+                <w:sz w:val="32"/>
+                <w:szCs w:val="40"/>
+                <w:lang w:bidi="ml-IN"/>
+              </w:rPr>
+              <w:t>–</w:t>
+            </w:r>
+            <w:proofErr w:type="spellStart"/>
+            <w:r>
+              <w:rPr>
+                <w:rFonts w:ascii="BRH Devanagari Extra" w:hAnsi="BRH Devanagari Extra" w:cs="BRH Devanagari Extra"/>
+                <w:color w:val="000000"/>
+                <w:sz w:val="40"/>
+                <w:szCs w:val="40"/>
+                <w:lang w:bidi="ml-IN"/>
+              </w:rPr>
+              <w:t>uÉ×iÉç</w:t>
+            </w:r>
+            <w:proofErr w:type="spellEnd"/>
+            <w:r>
+              <w:rPr>
+                <w:rFonts w:ascii="BRH Devanagari Extra" w:hAnsi="BRH Devanagari Extra" w:cs="BRH Devanagari Extra"/>
+                <w:color w:val="000000"/>
+                <w:sz w:val="40"/>
+                <w:szCs w:val="40"/>
+                <w:lang w:bidi="ml-IN"/>
+              </w:rPr>
+              <w:t xml:space="preserve"> | </w:t>
+            </w:r>
+            <w:proofErr w:type="spellStart"/>
             <w:r>
               <w:rPr>
                 <w:rFonts w:ascii="BRH Devanagari Extra" w:hAnsi="BRH Devanagari Extra" w:cs="BRH Devanagari Extra"/>
@@ -3089,6 +3244,7 @@
               </w:rPr>
               <w:t>ÌiÉ</w:t>
             </w:r>
+            <w:proofErr w:type="spellEnd"/>
             <w:r>
               <w:rPr>
                 <w:rFonts w:ascii="BRH Malayalam Extra" w:hAnsi="BRH Malayalam Extra" w:cs="BRH Devanagari Extra"/>
@@ -3100,6 +3256,7 @@
               </w:rPr>
               <w:t>–</w:t>
             </w:r>
+            <w:proofErr w:type="spellStart"/>
             <w:r>
               <w:rPr>
                 <w:rFonts w:ascii="BRH Devanagari Extra" w:hAnsi="BRH Devanagari Extra" w:cs="BRH Devanagari Extra"/>
@@ -3119,27 +3276,62 @@
                 <w:szCs w:val="40"/>
                 <w:lang w:bidi="ml-IN"/>
               </w:rPr>
-              <w:t>É×Sè rÉþ¥ÉqÉÑ</w:t>
-            </w:r>
-            <w:r>
-              <w:rPr>
-                <w:rFonts w:ascii="BRH Malayalam Extra" w:hAnsi="BRH Malayalam Extra" w:cs="BRH Devanagari Extra"/>
-                <w:color w:val="000000"/>
-                <w:sz w:val="32"/>
-                <w:szCs w:val="40"/>
-                <w:lang w:bidi="ml-IN"/>
-              </w:rPr>
-              <w:t>–</w:t>
-            </w:r>
-            <w:r>
-              <w:rPr>
-                <w:rFonts w:ascii="BRH Devanagari Extra" w:hAnsi="BRH Devanagari Extra" w:cs="BRH Devanagari Extra"/>
-                <w:color w:val="000000"/>
-                <w:sz w:val="40"/>
-                <w:szCs w:val="40"/>
-                <w:lang w:bidi="ml-IN"/>
-              </w:rPr>
-              <w:t xml:space="preserve">ZÉqÉç | </w:t>
+              <w:t>É×Sè</w:t>
+            </w:r>
+            <w:proofErr w:type="spellEnd"/>
+            <w:r>
+              <w:rPr>
+                <w:rFonts w:ascii="BRH Devanagari Extra" w:hAnsi="BRH Devanagari Extra" w:cs="BRH Devanagari Extra"/>
+                <w:color w:val="000000"/>
+                <w:sz w:val="40"/>
+                <w:szCs w:val="40"/>
+                <w:lang w:bidi="ml-IN"/>
+              </w:rPr>
+              <w:t xml:space="preserve"> </w:t>
+            </w:r>
+            <w:proofErr w:type="spellStart"/>
+            <w:r>
+              <w:rPr>
+                <w:rFonts w:ascii="BRH Devanagari Extra" w:hAnsi="BRH Devanagari Extra" w:cs="BRH Devanagari Extra"/>
+                <w:color w:val="000000"/>
+                <w:sz w:val="40"/>
+                <w:szCs w:val="40"/>
+                <w:lang w:bidi="ml-IN"/>
+              </w:rPr>
+              <w:t>rÉþ¥ÉqÉÑ</w:t>
+            </w:r>
+            <w:proofErr w:type="spellEnd"/>
+            <w:r>
+              <w:rPr>
+                <w:rFonts w:ascii="BRH Malayalam Extra" w:hAnsi="BRH Malayalam Extra" w:cs="BRH Devanagari Extra"/>
+                <w:color w:val="000000"/>
+                <w:sz w:val="32"/>
+                <w:szCs w:val="40"/>
+                <w:lang w:bidi="ml-IN"/>
+              </w:rPr>
+              <w:t>–</w:t>
+            </w:r>
+            <w:proofErr w:type="spellStart"/>
+            <w:r>
+              <w:rPr>
+                <w:rFonts w:ascii="BRH Devanagari Extra" w:hAnsi="BRH Devanagari Extra" w:cs="BRH Devanagari Extra"/>
+                <w:color w:val="000000"/>
+                <w:sz w:val="40"/>
+                <w:szCs w:val="40"/>
+                <w:lang w:bidi="ml-IN"/>
+              </w:rPr>
+              <w:t>ZÉqÉç</w:t>
+            </w:r>
+            <w:proofErr w:type="spellEnd"/>
+            <w:r>
+              <w:rPr>
+                <w:rFonts w:ascii="BRH Devanagari Extra" w:hAnsi="BRH Devanagari Extra" w:cs="BRH Devanagari Extra"/>
+                <w:color w:val="000000"/>
+                <w:sz w:val="40"/>
+                <w:szCs w:val="40"/>
+                <w:lang w:bidi="ml-IN"/>
+              </w:rPr>
+              <w:t xml:space="preserve"> | </w:t>
             </w:r>
           </w:p>
           <w:p>
@@ -3176,15 +3368,49 @@
               </w:rPr>
               <w:t>–</w:t>
             </w:r>
-            <w:r>
-              <w:rPr>
-                <w:rFonts w:ascii="BRH Devanagari Extra" w:hAnsi="BRH Devanagari Extra" w:cs="BRH Devanagari Extra"/>
-                <w:color w:val="000000"/>
-                <w:sz w:val="40"/>
-                <w:szCs w:val="40"/>
-                <w:lang w:bidi="ml-IN"/>
-              </w:rPr>
-              <w:t>uÉ×ÌSÌiÉþ Ì§É - uÉ×iÉç |</w:t>
+            <w:proofErr w:type="spellStart"/>
+            <w:r>
+              <w:rPr>
+                <w:rFonts w:ascii="BRH Devanagari Extra" w:hAnsi="BRH Devanagari Extra" w:cs="BRH Devanagari Extra"/>
+                <w:color w:val="000000"/>
+                <w:sz w:val="40"/>
+                <w:szCs w:val="40"/>
+                <w:lang w:bidi="ml-IN"/>
+              </w:rPr>
+              <w:t>uÉ×ÌSÌiÉþ</w:t>
+            </w:r>
+            <w:proofErr w:type="spellEnd"/>
+            <w:r>
+              <w:rPr>
+                <w:rFonts w:ascii="BRH Devanagari Extra" w:hAnsi="BRH Devanagari Extra" w:cs="BRH Devanagari Extra"/>
+                <w:color w:val="000000"/>
+                <w:sz w:val="40"/>
+                <w:szCs w:val="40"/>
+                <w:lang w:bidi="ml-IN"/>
+              </w:rPr>
+              <w:t xml:space="preserve"> Ì§É - </w:t>
+            </w:r>
+            <w:proofErr w:type="spellStart"/>
+            <w:r>
+              <w:rPr>
+                <w:rFonts w:ascii="BRH Devanagari Extra" w:hAnsi="BRH Devanagari Extra" w:cs="BRH Devanagari Extra"/>
+                <w:color w:val="000000"/>
+                <w:sz w:val="40"/>
+                <w:szCs w:val="40"/>
+                <w:lang w:bidi="ml-IN"/>
+              </w:rPr>
+              <w:t>uÉ×iÉç</w:t>
+            </w:r>
+            <w:proofErr w:type="spellEnd"/>
+            <w:r>
+              <w:rPr>
+                <w:rFonts w:ascii="BRH Devanagari Extra" w:hAnsi="BRH Devanagari Extra" w:cs="BRH Devanagari Extra"/>
+                <w:color w:val="000000"/>
+                <w:sz w:val="40"/>
+                <w:szCs w:val="40"/>
+                <w:lang w:bidi="ml-IN"/>
+              </w:rPr>
+              <w:t xml:space="preserve"> |</w:t>
             </w:r>
           </w:p>
         </w:tc>
@@ -3207,15 +3433,27 @@
                 <w:lang w:bidi="ml-IN"/>
               </w:rPr>
             </w:pPr>
-            <w:r>
-              <w:rPr>
-                <w:rFonts w:ascii="BRH Devanagari Extra" w:hAnsi="BRH Devanagari Extra" w:cs="BRH Devanagari Extra"/>
-                <w:color w:val="000000"/>
-                <w:sz w:val="40"/>
-                <w:szCs w:val="40"/>
-                <w:lang w:bidi="ml-IN"/>
-              </w:rPr>
-              <w:t xml:space="preserve">uÉæ </w:t>
+            <w:proofErr w:type="spellStart"/>
+            <w:r>
+              <w:rPr>
+                <w:rFonts w:ascii="BRH Devanagari Extra" w:hAnsi="BRH Devanagari Extra" w:cs="BRH Devanagari Extra"/>
+                <w:color w:val="000000"/>
+                <w:sz w:val="40"/>
+                <w:szCs w:val="40"/>
+                <w:lang w:bidi="ml-IN"/>
+              </w:rPr>
+              <w:t>uÉæ</w:t>
+            </w:r>
+            <w:proofErr w:type="spellEnd"/>
+            <w:r>
+              <w:rPr>
+                <w:rFonts w:ascii="BRH Devanagari Extra" w:hAnsi="BRH Devanagari Extra" w:cs="BRH Devanagari Extra"/>
+                <w:color w:val="000000"/>
+                <w:sz w:val="40"/>
+                <w:szCs w:val="40"/>
+                <w:lang w:bidi="ml-IN"/>
+              </w:rPr>
+              <w:t xml:space="preserve"> </w:t>
             </w:r>
             <w:r>
               <w:rPr>
@@ -3239,15 +3477,27 @@
               </w:rPr>
               <w:t>–</w:t>
             </w:r>
-            <w:r>
-              <w:rPr>
-                <w:rFonts w:ascii="BRH Devanagari Extra" w:hAnsi="BRH Devanagari Extra" w:cs="BRH Devanagari Extra"/>
-                <w:color w:val="000000"/>
-                <w:sz w:val="40"/>
-                <w:szCs w:val="40"/>
-                <w:lang w:bidi="ml-IN"/>
-              </w:rPr>
-              <w:t xml:space="preserve">uÉ×iÉç | </w:t>
+            <w:proofErr w:type="spellStart"/>
+            <w:r>
+              <w:rPr>
+                <w:rFonts w:ascii="BRH Devanagari Extra" w:hAnsi="BRH Devanagari Extra" w:cs="BRH Devanagari Extra"/>
+                <w:color w:val="000000"/>
+                <w:sz w:val="40"/>
+                <w:szCs w:val="40"/>
+                <w:lang w:bidi="ml-IN"/>
+              </w:rPr>
+              <w:t>uÉ×iÉç</w:t>
+            </w:r>
+            <w:proofErr w:type="spellEnd"/>
+            <w:r>
+              <w:rPr>
+                <w:rFonts w:ascii="BRH Devanagari Extra" w:hAnsi="BRH Devanagari Extra" w:cs="BRH Devanagari Extra"/>
+                <w:color w:val="000000"/>
+                <w:sz w:val="40"/>
+                <w:szCs w:val="40"/>
+                <w:lang w:bidi="ml-IN"/>
+              </w:rPr>
+              <w:t xml:space="preserve"> | </w:t>
             </w:r>
             <w:r>
               <w:rPr>
@@ -3270,35 +3520,71 @@
               </w:rPr>
               <w:t>–</w:t>
             </w:r>
-            <w:r>
-              <w:rPr>
-                <w:rFonts w:ascii="BRH Devanagari Extra" w:hAnsi="BRH Devanagari Extra" w:cs="BRH Devanagari Extra"/>
-                <w:color w:val="000000"/>
-                <w:sz w:val="40"/>
-                <w:szCs w:val="40"/>
-                <w:lang w:bidi="ml-IN"/>
-              </w:rPr>
-              <w:t>uÉ×Sè rÉþ¥ÉqÉÑ</w:t>
-            </w:r>
-            <w:r>
-              <w:rPr>
-                <w:rFonts w:ascii="BRH Malayalam Extra" w:hAnsi="BRH Malayalam Extra" w:cs="BRH Devanagari Extra"/>
-                <w:color w:val="000000"/>
-                <w:sz w:val="32"/>
-                <w:szCs w:val="40"/>
-                <w:lang w:bidi="ml-IN"/>
-              </w:rPr>
-              <w:t>–</w:t>
-            </w:r>
-            <w:r>
-              <w:rPr>
-                <w:rFonts w:ascii="BRH Devanagari Extra" w:hAnsi="BRH Devanagari Extra" w:cs="BRH Devanagari Extra"/>
-                <w:color w:val="000000"/>
-                <w:sz w:val="40"/>
-                <w:szCs w:val="40"/>
-                <w:lang w:bidi="ml-IN"/>
-              </w:rPr>
-              <w:t xml:space="preserve">ZÉqÉç | </w:t>
+            <w:proofErr w:type="spellStart"/>
+            <w:r>
+              <w:rPr>
+                <w:rFonts w:ascii="BRH Devanagari Extra" w:hAnsi="BRH Devanagari Extra" w:cs="BRH Devanagari Extra"/>
+                <w:color w:val="000000"/>
+                <w:sz w:val="40"/>
+                <w:szCs w:val="40"/>
+                <w:lang w:bidi="ml-IN"/>
+              </w:rPr>
+              <w:t>uÉ×Sè</w:t>
+            </w:r>
+            <w:proofErr w:type="spellEnd"/>
+            <w:r>
+              <w:rPr>
+                <w:rFonts w:ascii="BRH Devanagari Extra" w:hAnsi="BRH Devanagari Extra" w:cs="BRH Devanagari Extra"/>
+                <w:color w:val="000000"/>
+                <w:sz w:val="40"/>
+                <w:szCs w:val="40"/>
+                <w:lang w:bidi="ml-IN"/>
+              </w:rPr>
+              <w:t xml:space="preserve"> </w:t>
+            </w:r>
+            <w:proofErr w:type="spellStart"/>
+            <w:r>
+              <w:rPr>
+                <w:rFonts w:ascii="BRH Devanagari Extra" w:hAnsi="BRH Devanagari Extra" w:cs="BRH Devanagari Extra"/>
+                <w:color w:val="000000"/>
+                <w:sz w:val="40"/>
+                <w:szCs w:val="40"/>
+                <w:lang w:bidi="ml-IN"/>
+              </w:rPr>
+              <w:t>rÉþ¥ÉqÉÑ</w:t>
+            </w:r>
+            <w:proofErr w:type="spellEnd"/>
+            <w:r>
+              <w:rPr>
+                <w:rFonts w:ascii="BRH Malayalam Extra" w:hAnsi="BRH Malayalam Extra" w:cs="BRH Devanagari Extra"/>
+                <w:color w:val="000000"/>
+                <w:sz w:val="32"/>
+                <w:szCs w:val="40"/>
+                <w:lang w:bidi="ml-IN"/>
+              </w:rPr>
+              <w:t>–</w:t>
+            </w:r>
+            <w:proofErr w:type="spellStart"/>
+            <w:r>
+              <w:rPr>
+                <w:rFonts w:ascii="BRH Devanagari Extra" w:hAnsi="BRH Devanagari Extra" w:cs="BRH Devanagari Extra"/>
+                <w:color w:val="000000"/>
+                <w:sz w:val="40"/>
+                <w:szCs w:val="40"/>
+                <w:lang w:bidi="ml-IN"/>
+              </w:rPr>
+              <w:t>ZÉqÉç</w:t>
+            </w:r>
+            <w:proofErr w:type="spellEnd"/>
+            <w:r>
+              <w:rPr>
+                <w:rFonts w:ascii="BRH Devanagari Extra" w:hAnsi="BRH Devanagari Extra" w:cs="BRH Devanagari Extra"/>
+                <w:color w:val="000000"/>
+                <w:sz w:val="40"/>
+                <w:szCs w:val="40"/>
+                <w:lang w:bidi="ml-IN"/>
+              </w:rPr>
+              <w:t xml:space="preserve"> | </w:t>
             </w:r>
           </w:p>
           <w:p>
@@ -3335,20 +3621,69 @@
               </w:rPr>
               <w:t>–</w:t>
             </w:r>
-            <w:r>
-              <w:rPr>
-                <w:rFonts w:ascii="BRH Devanagari Extra" w:hAnsi="BRH Devanagari Extra" w:cs="BRH Devanagari Extra"/>
-                <w:color w:val="000000"/>
-                <w:sz w:val="40"/>
-                <w:szCs w:val="40"/>
-                <w:lang w:bidi="ml-IN"/>
-              </w:rPr>
-              <w:t>uÉ×ÌSÌiÉþ Ì§É - uÉ×iÉç |</w:t>
+            <w:proofErr w:type="spellStart"/>
+            <w:r>
+              <w:rPr>
+                <w:rFonts w:ascii="BRH Devanagari Extra" w:hAnsi="BRH Devanagari Extra" w:cs="BRH Devanagari Extra"/>
+                <w:color w:val="000000"/>
+                <w:sz w:val="40"/>
+                <w:szCs w:val="40"/>
+                <w:lang w:bidi="ml-IN"/>
+              </w:rPr>
+              <w:t>uÉ×ÌSÌiÉþ</w:t>
+            </w:r>
+            <w:proofErr w:type="spellEnd"/>
+            <w:r>
+              <w:rPr>
+                <w:rFonts w:ascii="BRH Devanagari Extra" w:hAnsi="BRH Devanagari Extra" w:cs="BRH Devanagari Extra"/>
+                <w:color w:val="000000"/>
+                <w:sz w:val="40"/>
+                <w:szCs w:val="40"/>
+                <w:lang w:bidi="ml-IN"/>
+              </w:rPr>
+              <w:t xml:space="preserve"> Ì§É - </w:t>
+            </w:r>
+            <w:proofErr w:type="spellStart"/>
+            <w:r>
+              <w:rPr>
+                <w:rFonts w:ascii="BRH Devanagari Extra" w:hAnsi="BRH Devanagari Extra" w:cs="BRH Devanagari Extra"/>
+                <w:color w:val="000000"/>
+                <w:sz w:val="40"/>
+                <w:szCs w:val="40"/>
+                <w:lang w:bidi="ml-IN"/>
+              </w:rPr>
+              <w:t>uÉ×iÉç</w:t>
+            </w:r>
+            <w:proofErr w:type="spellEnd"/>
+            <w:r>
+              <w:rPr>
+                <w:rFonts w:ascii="BRH Devanagari Extra" w:hAnsi="BRH Devanagari Extra" w:cs="BRH Devanagari Extra"/>
+                <w:color w:val="000000"/>
+                <w:sz w:val="40"/>
+                <w:szCs w:val="40"/>
+                <w:lang w:bidi="ml-IN"/>
+              </w:rPr>
+              <w:t xml:space="preserve"> |</w:t>
             </w:r>
           </w:p>
         </w:tc>
       </w:tr>
     </w:tbl>
+    <w:p>
+      <w:pPr>
+        <w:pBdr>
+          <w:bottom w:val="double" w:sz="6" w:space="1" w:color="auto"/>
+        </w:pBdr>
+        <w:jc w:val="center"/>
+        <w:rPr>
+          <w:b/>
+          <w:bCs/>
+          <w:sz w:val="32"/>
+          <w:szCs w:val="32"/>
+          <w:u w:val="single"/>
+        </w:rPr>
+      </w:pPr>
+    </w:p>
     <w:p>
       <w:pPr>
         <w:jc w:val="center"/>
@@ -3360,7 +3695,10 @@
           <w:u w:val="single"/>
         </w:rPr>
       </w:pPr>
-      <w:r>
+    </w:p>
+    <w:p>
+      <w:pPr>
+        <w:jc w:val="center"/>
         <w:rPr>
           <w:b/>
           <w:bCs/>
@@ -3368,8 +3706,19 @@
           <w:szCs w:val="32"/>
           <w:u w:val="single"/>
         </w:rPr>
-        <w:t>=============</w:t>
-      </w:r>
+      </w:pPr>
+    </w:p>
+    <w:p>
+      <w:pPr>
+        <w:jc w:val="center"/>
+        <w:rPr>
+          <w:b/>
+          <w:bCs/>
+          <w:sz w:val="32"/>
+          <w:szCs w:val="32"/>
+          <w:u w:val="single"/>
+        </w:rPr>
+      </w:pPr>
     </w:p>
     <w:p>
       <w:pPr>
@@ -3390,6 +3739,7 @@
           <w:szCs w:val="32"/>
           <w:u w:val="single"/>
         </w:rPr>
+        <w:lastRenderedPageBreak/>
         <w:t xml:space="preserve">TS </w:t>
       </w:r>
       <w:r>
@@ -3539,12 +3889,16 @@
               <w:spacing w:before="0" w:line="240" w:lineRule="auto"/>
               <w:jc w:val="center"/>
               <w:rPr>
-                <w:sz w:val="32"/>
-                <w:szCs w:val="32"/>
-              </w:rPr>
-            </w:pPr>
-            <w:r>
-              <w:rPr>
+                <w:b/>
+                <w:bCs/>
+                <w:sz w:val="32"/>
+                <w:szCs w:val="32"/>
+              </w:rPr>
+            </w:pPr>
+            <w:r>
+              <w:rPr>
+                <w:b/>
+                <w:bCs/>
                 <w:sz w:val="32"/>
                 <w:szCs w:val="32"/>
               </w:rPr>
@@ -3556,12 +3910,16 @@
               <w:spacing w:before="0" w:line="240" w:lineRule="auto"/>
               <w:jc w:val="center"/>
               <w:rPr>
-                <w:sz w:val="32"/>
-                <w:szCs w:val="32"/>
-              </w:rPr>
-            </w:pPr>
-            <w:r>
-              <w:rPr>
+                <w:b/>
+                <w:bCs/>
+                <w:sz w:val="32"/>
+                <w:szCs w:val="32"/>
+              </w:rPr>
+            </w:pPr>
+            <w:r>
+              <w:rPr>
+                <w:b/>
+                <w:bCs/>
                 <w:sz w:val="32"/>
                 <w:szCs w:val="32"/>
               </w:rPr>
@@ -3578,12 +3936,16 @@
               <w:spacing w:before="0" w:line="240" w:lineRule="auto"/>
               <w:jc w:val="center"/>
               <w:rPr>
-                <w:sz w:val="32"/>
-                <w:szCs w:val="32"/>
-              </w:rPr>
-            </w:pPr>
-            <w:r>
-              <w:rPr>
+                <w:b/>
+                <w:bCs/>
+                <w:sz w:val="32"/>
+                <w:szCs w:val="32"/>
+              </w:rPr>
+            </w:pPr>
+            <w:r>
+              <w:rPr>
+                <w:b/>
+                <w:bCs/>
                 <w:sz w:val="32"/>
                 <w:szCs w:val="32"/>
               </w:rPr>
@@ -3601,17 +3963,31 @@
               <w:ind w:right="-18"/>
               <w:jc w:val="center"/>
               <w:rPr>
-                <w:sz w:val="32"/>
-                <w:szCs w:val="32"/>
-              </w:rPr>
-            </w:pPr>
-            <w:r>
-              <w:rPr>
+                <w:b/>
+                <w:bCs/>
+                <w:sz w:val="32"/>
+                <w:szCs w:val="32"/>
+              </w:rPr>
+            </w:pPr>
+            <w:r>
+              <w:rPr>
+                <w:b/>
+                <w:bCs/>
                 <w:sz w:val="32"/>
                 <w:szCs w:val="32"/>
               </w:rPr>
               <w:t>To be read as or corrected as</w:t>
             </w:r>
+          </w:p>
+          <w:p>
+            <w:pPr>
+              <w:rPr>
+                <w:b/>
+                <w:bCs/>
+                <w:sz w:val="32"/>
+                <w:szCs w:val="32"/>
+              </w:rPr>
+            </w:pPr>
           </w:p>
         </w:tc>
       </w:tr>
@@ -3648,7 +4024,6 @@
                 <w:sz w:val="28"/>
                 <w:szCs w:val="32"/>
               </w:rPr>
-              <w:lastRenderedPageBreak/>
               <w:t>T.S.</w:t>
             </w:r>
             <w:r>
@@ -3817,6 +4192,7 @@
                 <w:lang w:bidi="ml-IN"/>
               </w:rPr>
             </w:pPr>
+            <w:proofErr w:type="spellStart"/>
             <w:r>
               <w:rPr>
                 <w:rFonts w:ascii="BRH Devanagari Extra" w:hAnsi="BRH Devanagari Extra" w:cs="BRH Devanagari Extra"/>
@@ -3827,25 +4203,48 @@
               </w:rPr>
               <w:t>ÌuÉkÉ×þirÉæ</w:t>
             </w:r>
-            <w:r>
-              <w:rPr>
-                <w:rFonts w:ascii="BRH Malayalam Extra" w:hAnsi="BRH Malayalam Extra" w:cs="BRH Devanagari Extra"/>
-                <w:color w:val="000000"/>
-                <w:sz w:val="32"/>
-                <w:szCs w:val="40"/>
-                <w:lang w:bidi="ml-IN"/>
-              </w:rPr>
-              <w:t>–</w:t>
-            </w:r>
-            <w:r>
-              <w:rPr>
-                <w:rFonts w:ascii="BRH Devanagari Extra" w:hAnsi="BRH Devanagari Extra" w:cs="BRH Devanagari Extra"/>
-                <w:color w:val="000000"/>
-                <w:sz w:val="40"/>
-                <w:szCs w:val="40"/>
-                <w:lang w:bidi="ml-IN"/>
-              </w:rPr>
-              <w:t xml:space="preserve"> SzÉþ | </w:t>
+            <w:proofErr w:type="spellEnd"/>
+            <w:r>
+              <w:rPr>
+                <w:rFonts w:ascii="BRH Malayalam Extra" w:hAnsi="BRH Malayalam Extra" w:cs="BRH Devanagari Extra"/>
+                <w:color w:val="000000"/>
+                <w:sz w:val="32"/>
+                <w:szCs w:val="40"/>
+                <w:lang w:bidi="ml-IN"/>
+              </w:rPr>
+              <w:t>–</w:t>
+            </w:r>
+            <w:r>
+              <w:rPr>
+                <w:rFonts w:ascii="BRH Devanagari Extra" w:hAnsi="BRH Devanagari Extra" w:cs="BRH Devanagari Extra"/>
+                <w:color w:val="000000"/>
+                <w:sz w:val="40"/>
+                <w:szCs w:val="40"/>
+                <w:lang w:bidi="ml-IN"/>
+              </w:rPr>
+              <w:t xml:space="preserve"> </w:t>
+            </w:r>
+            <w:proofErr w:type="spellStart"/>
+            <w:r>
+              <w:rPr>
+                <w:rFonts w:ascii="BRH Devanagari Extra" w:hAnsi="BRH Devanagari Extra" w:cs="BRH Devanagari Extra"/>
+                <w:color w:val="000000"/>
+                <w:sz w:val="40"/>
+                <w:szCs w:val="40"/>
+                <w:lang w:bidi="ml-IN"/>
+              </w:rPr>
+              <w:t>SzÉþ</w:t>
+            </w:r>
+            <w:proofErr w:type="spellEnd"/>
+            <w:r>
+              <w:rPr>
+                <w:rFonts w:ascii="BRH Devanagari Extra" w:hAnsi="BRH Devanagari Extra" w:cs="BRH Devanagari Extra"/>
+                <w:color w:val="000000"/>
+                <w:sz w:val="40"/>
+                <w:szCs w:val="40"/>
+                <w:lang w:bidi="ml-IN"/>
+              </w:rPr>
+              <w:t xml:space="preserve"> | </w:t>
             </w:r>
           </w:p>
           <w:p>
@@ -3862,6 +4261,7 @@
                 <w:szCs w:val="40"/>
               </w:rPr>
             </w:pPr>
+            <w:proofErr w:type="spellStart"/>
             <w:r>
               <w:rPr>
                 <w:rFonts w:ascii="BRH Devanagari Extra" w:hAnsi="BRH Devanagari Extra" w:cs="BRH Devanagari Extra"/>
@@ -3893,56 +4293,92 @@
               </w:rPr>
               <w:t>irÉÉ</w:t>
             </w:r>
-            <w:r>
-              <w:rPr>
-                <w:rFonts w:ascii="BRH Malayalam Extra" w:hAnsi="BRH Malayalam Extra" w:cs="BRH Devanagari Extra"/>
-                <w:color w:val="000000"/>
-                <w:sz w:val="32"/>
-                <w:szCs w:val="40"/>
-                <w:lang w:bidi="ml-IN"/>
-              </w:rPr>
-              <w:t>–</w:t>
-            </w:r>
-            <w:r>
-              <w:rPr>
-                <w:rFonts w:ascii="BRH Devanagari Extra" w:hAnsi="BRH Devanagari Extra" w:cs="BRH Devanagari Extra"/>
-                <w:color w:val="000000"/>
-                <w:sz w:val="40"/>
-                <w:szCs w:val="40"/>
-                <w:lang w:bidi="ml-IN"/>
-              </w:rPr>
-              <w:t xml:space="preserve"> CÌiÉ</w:t>
-            </w:r>
-            <w:r>
-              <w:rPr>
-                <w:rFonts w:ascii="BRH Malayalam Extra" w:hAnsi="BRH Malayalam Extra" w:cs="BRH Devanagari Extra"/>
-                <w:color w:val="000000"/>
-                <w:sz w:val="32"/>
-                <w:szCs w:val="40"/>
-                <w:lang w:bidi="ml-IN"/>
-              </w:rPr>
-              <w:t>–</w:t>
-            </w:r>
-            <w:r>
-              <w:rPr>
-                <w:rFonts w:ascii="BRH Devanagari Extra" w:hAnsi="BRH Devanagari Extra" w:cs="BRH Devanagari Extra"/>
-                <w:color w:val="000000"/>
-                <w:sz w:val="40"/>
-                <w:szCs w:val="40"/>
-                <w:lang w:bidi="ml-IN"/>
-              </w:rPr>
-              <w:t xml:space="preserve"> ÌuÉ - kÉ×</w:t>
-            </w:r>
-            <w:r>
-              <w:rPr>
-                <w:rFonts w:ascii="BRH Malayalam Extra" w:hAnsi="BRH Malayalam Extra" w:cs="BRH Devanagari Extra"/>
-                <w:color w:val="000000"/>
-                <w:sz w:val="32"/>
-                <w:szCs w:val="40"/>
-                <w:lang w:bidi="ml-IN"/>
-              </w:rPr>
-              <w:t>–</w:t>
-            </w:r>
+            <w:proofErr w:type="spellEnd"/>
+            <w:r>
+              <w:rPr>
+                <w:rFonts w:ascii="BRH Malayalam Extra" w:hAnsi="BRH Malayalam Extra" w:cs="BRH Devanagari Extra"/>
+                <w:color w:val="000000"/>
+                <w:sz w:val="32"/>
+                <w:szCs w:val="40"/>
+                <w:lang w:bidi="ml-IN"/>
+              </w:rPr>
+              <w:t>–</w:t>
+            </w:r>
+            <w:r>
+              <w:rPr>
+                <w:rFonts w:ascii="BRH Devanagari Extra" w:hAnsi="BRH Devanagari Extra" w:cs="BRH Devanagari Extra"/>
+                <w:color w:val="000000"/>
+                <w:sz w:val="40"/>
+                <w:szCs w:val="40"/>
+                <w:lang w:bidi="ml-IN"/>
+              </w:rPr>
+              <w:t xml:space="preserve"> </w:t>
+            </w:r>
+            <w:proofErr w:type="spellStart"/>
+            <w:r>
+              <w:rPr>
+                <w:rFonts w:ascii="BRH Devanagari Extra" w:hAnsi="BRH Devanagari Extra" w:cs="BRH Devanagari Extra"/>
+                <w:color w:val="000000"/>
+                <w:sz w:val="40"/>
+                <w:szCs w:val="40"/>
+                <w:lang w:bidi="ml-IN"/>
+              </w:rPr>
+              <w:t>CÌiÉ</w:t>
+            </w:r>
+            <w:proofErr w:type="spellEnd"/>
+            <w:r>
+              <w:rPr>
+                <w:rFonts w:ascii="BRH Malayalam Extra" w:hAnsi="BRH Malayalam Extra" w:cs="BRH Devanagari Extra"/>
+                <w:color w:val="000000"/>
+                <w:sz w:val="32"/>
+                <w:szCs w:val="40"/>
+                <w:lang w:bidi="ml-IN"/>
+              </w:rPr>
+              <w:t>–</w:t>
+            </w:r>
+            <w:r>
+              <w:rPr>
+                <w:rFonts w:ascii="BRH Devanagari Extra" w:hAnsi="BRH Devanagari Extra" w:cs="BRH Devanagari Extra"/>
+                <w:color w:val="000000"/>
+                <w:sz w:val="40"/>
+                <w:szCs w:val="40"/>
+                <w:lang w:bidi="ml-IN"/>
+              </w:rPr>
+              <w:t xml:space="preserve"> </w:t>
+            </w:r>
+            <w:proofErr w:type="spellStart"/>
+            <w:r>
+              <w:rPr>
+                <w:rFonts w:ascii="BRH Devanagari Extra" w:hAnsi="BRH Devanagari Extra" w:cs="BRH Devanagari Extra"/>
+                <w:color w:val="000000"/>
+                <w:sz w:val="40"/>
+                <w:szCs w:val="40"/>
+                <w:lang w:bidi="ml-IN"/>
+              </w:rPr>
+              <w:t>ÌuÉ</w:t>
+            </w:r>
+            <w:proofErr w:type="spellEnd"/>
+            <w:r>
+              <w:rPr>
+                <w:rFonts w:ascii="BRH Devanagari Extra" w:hAnsi="BRH Devanagari Extra" w:cs="BRH Devanagari Extra"/>
+                <w:color w:val="000000"/>
+                <w:sz w:val="40"/>
+                <w:szCs w:val="40"/>
+                <w:lang w:bidi="ml-IN"/>
+              </w:rPr>
+              <w:t xml:space="preserve"> - kÉ×</w:t>
+            </w:r>
+            <w:r>
+              <w:rPr>
+                <w:rFonts w:ascii="BRH Malayalam Extra" w:hAnsi="BRH Malayalam Extra" w:cs="BRH Devanagari Extra"/>
+                <w:color w:val="000000"/>
+                <w:sz w:val="32"/>
+                <w:szCs w:val="40"/>
+                <w:lang w:bidi="ml-IN"/>
+              </w:rPr>
+              <w:t>–</w:t>
+            </w:r>
+            <w:proofErr w:type="spellStart"/>
             <w:r>
               <w:rPr>
                 <w:rFonts w:ascii="BRH Devanagari Extra" w:hAnsi="BRH Devanagari Extra" w:cs="BRH Devanagari Extra"/>
@@ -3953,6 +4389,7 @@
               </w:rPr>
               <w:t>irÉæ</w:t>
             </w:r>
+            <w:proofErr w:type="spellEnd"/>
             <w:r>
               <w:rPr>
                 <w:rFonts w:ascii="BRH Malayalam Extra" w:hAnsi="BRH Malayalam Extra" w:cs="BRH Devanagari Extra"/>
@@ -3994,6 +4431,7 @@
                 <w:lang w:bidi="ml-IN"/>
               </w:rPr>
             </w:pPr>
+            <w:proofErr w:type="spellStart"/>
             <w:r>
               <w:rPr>
                 <w:rFonts w:ascii="BRH Devanagari Extra" w:hAnsi="BRH Devanagari Extra" w:cs="BRH Devanagari Extra"/>
@@ -4004,25 +4442,48 @@
               </w:rPr>
               <w:t>ÌuÉkÉ×þirÉæ</w:t>
             </w:r>
-            <w:r>
-              <w:rPr>
-                <w:rFonts w:ascii="BRH Malayalam Extra" w:hAnsi="BRH Malayalam Extra" w:cs="BRH Devanagari Extra"/>
-                <w:color w:val="000000"/>
-                <w:sz w:val="32"/>
-                <w:szCs w:val="40"/>
-                <w:lang w:bidi="ml-IN"/>
-              </w:rPr>
-              <w:t>–</w:t>
-            </w:r>
-            <w:r>
-              <w:rPr>
-                <w:rFonts w:ascii="BRH Devanagari Extra" w:hAnsi="BRH Devanagari Extra" w:cs="BRH Devanagari Extra"/>
-                <w:color w:val="000000"/>
-                <w:sz w:val="40"/>
-                <w:szCs w:val="40"/>
-                <w:lang w:bidi="ml-IN"/>
-              </w:rPr>
-              <w:t xml:space="preserve"> SzÉþ | </w:t>
+            <w:proofErr w:type="spellEnd"/>
+            <w:r>
+              <w:rPr>
+                <w:rFonts w:ascii="BRH Malayalam Extra" w:hAnsi="BRH Malayalam Extra" w:cs="BRH Devanagari Extra"/>
+                <w:color w:val="000000"/>
+                <w:sz w:val="32"/>
+                <w:szCs w:val="40"/>
+                <w:lang w:bidi="ml-IN"/>
+              </w:rPr>
+              <w:t>–</w:t>
+            </w:r>
+            <w:r>
+              <w:rPr>
+                <w:rFonts w:ascii="BRH Devanagari Extra" w:hAnsi="BRH Devanagari Extra" w:cs="BRH Devanagari Extra"/>
+                <w:color w:val="000000"/>
+                <w:sz w:val="40"/>
+                <w:szCs w:val="40"/>
+                <w:lang w:bidi="ml-IN"/>
+              </w:rPr>
+              <w:t xml:space="preserve"> </w:t>
+            </w:r>
+            <w:proofErr w:type="spellStart"/>
+            <w:r>
+              <w:rPr>
+                <w:rFonts w:ascii="BRH Devanagari Extra" w:hAnsi="BRH Devanagari Extra" w:cs="BRH Devanagari Extra"/>
+                <w:color w:val="000000"/>
+                <w:sz w:val="40"/>
+                <w:szCs w:val="40"/>
+                <w:lang w:bidi="ml-IN"/>
+              </w:rPr>
+              <w:t>SzÉþ</w:t>
+            </w:r>
+            <w:proofErr w:type="spellEnd"/>
+            <w:r>
+              <w:rPr>
+                <w:rFonts w:ascii="BRH Devanagari Extra" w:hAnsi="BRH Devanagari Extra" w:cs="BRH Devanagari Extra"/>
+                <w:color w:val="000000"/>
+                <w:sz w:val="40"/>
+                <w:szCs w:val="40"/>
+                <w:lang w:bidi="ml-IN"/>
+              </w:rPr>
+              <w:t xml:space="preserve"> | </w:t>
             </w:r>
           </w:p>
           <w:p>
@@ -4039,6 +4500,7 @@
                 <w:szCs w:val="40"/>
               </w:rPr>
             </w:pPr>
+            <w:proofErr w:type="spellStart"/>
             <w:r>
               <w:rPr>
                 <w:rFonts w:ascii="BRH Devanagari Extra" w:hAnsi="BRH Devanagari Extra" w:cs="BRH Devanagari Extra"/>
@@ -4070,56 +4532,92 @@
               </w:rPr>
               <w:t>þirÉÉ</w:t>
             </w:r>
-            <w:r>
-              <w:rPr>
-                <w:rFonts w:ascii="BRH Malayalam Extra" w:hAnsi="BRH Malayalam Extra" w:cs="BRH Devanagari Extra"/>
-                <w:color w:val="000000"/>
-                <w:sz w:val="32"/>
-                <w:szCs w:val="40"/>
-                <w:lang w:bidi="ml-IN"/>
-              </w:rPr>
-              <w:t>–</w:t>
-            </w:r>
-            <w:r>
-              <w:rPr>
-                <w:rFonts w:ascii="BRH Devanagari Extra" w:hAnsi="BRH Devanagari Extra" w:cs="BRH Devanagari Extra"/>
-                <w:color w:val="000000"/>
-                <w:sz w:val="40"/>
-                <w:szCs w:val="40"/>
-                <w:lang w:bidi="ml-IN"/>
-              </w:rPr>
-              <w:t xml:space="preserve"> CÌiÉ</w:t>
-            </w:r>
-            <w:r>
-              <w:rPr>
-                <w:rFonts w:ascii="BRH Malayalam Extra" w:hAnsi="BRH Malayalam Extra" w:cs="BRH Devanagari Extra"/>
-                <w:color w:val="000000"/>
-                <w:sz w:val="32"/>
-                <w:szCs w:val="40"/>
-                <w:lang w:bidi="ml-IN"/>
-              </w:rPr>
-              <w:t>–</w:t>
-            </w:r>
-            <w:r>
-              <w:rPr>
-                <w:rFonts w:ascii="BRH Devanagari Extra" w:hAnsi="BRH Devanagari Extra" w:cs="BRH Devanagari Extra"/>
-                <w:color w:val="000000"/>
-                <w:sz w:val="40"/>
-                <w:szCs w:val="40"/>
-                <w:lang w:bidi="ml-IN"/>
-              </w:rPr>
-              <w:t xml:space="preserve"> ÌuÉ - kÉ×</w:t>
-            </w:r>
-            <w:r>
-              <w:rPr>
-                <w:rFonts w:ascii="BRH Malayalam Extra" w:hAnsi="BRH Malayalam Extra" w:cs="BRH Devanagari Extra"/>
-                <w:color w:val="000000"/>
-                <w:sz w:val="32"/>
-                <w:szCs w:val="40"/>
-                <w:lang w:bidi="ml-IN"/>
-              </w:rPr>
-              <w:t>–</w:t>
-            </w:r>
+            <w:proofErr w:type="spellEnd"/>
+            <w:r>
+              <w:rPr>
+                <w:rFonts w:ascii="BRH Malayalam Extra" w:hAnsi="BRH Malayalam Extra" w:cs="BRH Devanagari Extra"/>
+                <w:color w:val="000000"/>
+                <w:sz w:val="32"/>
+                <w:szCs w:val="40"/>
+                <w:lang w:bidi="ml-IN"/>
+              </w:rPr>
+              <w:t>–</w:t>
+            </w:r>
+            <w:r>
+              <w:rPr>
+                <w:rFonts w:ascii="BRH Devanagari Extra" w:hAnsi="BRH Devanagari Extra" w:cs="BRH Devanagari Extra"/>
+                <w:color w:val="000000"/>
+                <w:sz w:val="40"/>
+                <w:szCs w:val="40"/>
+                <w:lang w:bidi="ml-IN"/>
+              </w:rPr>
+              <w:t xml:space="preserve"> </w:t>
+            </w:r>
+            <w:proofErr w:type="spellStart"/>
+            <w:r>
+              <w:rPr>
+                <w:rFonts w:ascii="BRH Devanagari Extra" w:hAnsi="BRH Devanagari Extra" w:cs="BRH Devanagari Extra"/>
+                <w:color w:val="000000"/>
+                <w:sz w:val="40"/>
+                <w:szCs w:val="40"/>
+                <w:lang w:bidi="ml-IN"/>
+              </w:rPr>
+              <w:t>CÌiÉ</w:t>
+            </w:r>
+            <w:proofErr w:type="spellEnd"/>
+            <w:r>
+              <w:rPr>
+                <w:rFonts w:ascii="BRH Malayalam Extra" w:hAnsi="BRH Malayalam Extra" w:cs="BRH Devanagari Extra"/>
+                <w:color w:val="000000"/>
+                <w:sz w:val="32"/>
+                <w:szCs w:val="40"/>
+                <w:lang w:bidi="ml-IN"/>
+              </w:rPr>
+              <w:t>–</w:t>
+            </w:r>
+            <w:r>
+              <w:rPr>
+                <w:rFonts w:ascii="BRH Devanagari Extra" w:hAnsi="BRH Devanagari Extra" w:cs="BRH Devanagari Extra"/>
+                <w:color w:val="000000"/>
+                <w:sz w:val="40"/>
+                <w:szCs w:val="40"/>
+                <w:lang w:bidi="ml-IN"/>
+              </w:rPr>
+              <w:t xml:space="preserve"> </w:t>
+            </w:r>
+            <w:proofErr w:type="spellStart"/>
+            <w:r>
+              <w:rPr>
+                <w:rFonts w:ascii="BRH Devanagari Extra" w:hAnsi="BRH Devanagari Extra" w:cs="BRH Devanagari Extra"/>
+                <w:color w:val="000000"/>
+                <w:sz w:val="40"/>
+                <w:szCs w:val="40"/>
+                <w:lang w:bidi="ml-IN"/>
+              </w:rPr>
+              <w:t>ÌuÉ</w:t>
+            </w:r>
+            <w:proofErr w:type="spellEnd"/>
+            <w:r>
+              <w:rPr>
+                <w:rFonts w:ascii="BRH Devanagari Extra" w:hAnsi="BRH Devanagari Extra" w:cs="BRH Devanagari Extra"/>
+                <w:color w:val="000000"/>
+                <w:sz w:val="40"/>
+                <w:szCs w:val="40"/>
+                <w:lang w:bidi="ml-IN"/>
+              </w:rPr>
+              <w:t xml:space="preserve"> - kÉ×</w:t>
+            </w:r>
+            <w:r>
+              <w:rPr>
+                <w:rFonts w:ascii="BRH Malayalam Extra" w:hAnsi="BRH Malayalam Extra" w:cs="BRH Devanagari Extra"/>
+                <w:color w:val="000000"/>
+                <w:sz w:val="32"/>
+                <w:szCs w:val="40"/>
+                <w:lang w:bidi="ml-IN"/>
+              </w:rPr>
+              <w:t>–</w:t>
+            </w:r>
+            <w:proofErr w:type="spellStart"/>
             <w:r>
               <w:rPr>
                 <w:rFonts w:ascii="BRH Devanagari Extra" w:hAnsi="BRH Devanagari Extra" w:cs="BRH Devanagari Extra"/>
@@ -4130,6 +4628,7 @@
               </w:rPr>
               <w:t>irÉæ</w:t>
             </w:r>
+            <w:proofErr w:type="spellEnd"/>
           </w:p>
         </w:tc>
       </w:tr>
@@ -4290,7 +4789,51 @@
                 <w:szCs w:val="40"/>
                 <w:lang w:bidi="ml-IN"/>
               </w:rPr>
-              <w:t xml:space="preserve">¶ÉÉiÉç mÉëÌiÉþÌ¸irÉæ | </w:t>
+              <w:t>¶</w:t>
+            </w:r>
+            <w:proofErr w:type="spellStart"/>
+            <w:r>
+              <w:rPr>
+                <w:rFonts w:ascii="BRH Devanagari Extra" w:hAnsi="BRH Devanagari Extra" w:cs="BRH Devanagari Extra"/>
+                <w:color w:val="000000"/>
+                <w:sz w:val="40"/>
+                <w:szCs w:val="40"/>
+                <w:lang w:bidi="ml-IN"/>
+              </w:rPr>
+              <w:t>ÉÉiÉç</w:t>
+            </w:r>
+            <w:proofErr w:type="spellEnd"/>
+            <w:r>
+              <w:rPr>
+                <w:rFonts w:ascii="BRH Devanagari Extra" w:hAnsi="BRH Devanagari Extra" w:cs="BRH Devanagari Extra"/>
+                <w:color w:val="000000"/>
+                <w:sz w:val="40"/>
+                <w:szCs w:val="40"/>
+                <w:lang w:bidi="ml-IN"/>
+              </w:rPr>
+              <w:t xml:space="preserve"> </w:t>
+            </w:r>
+            <w:proofErr w:type="spellStart"/>
+            <w:r>
+              <w:rPr>
+                <w:rFonts w:ascii="BRH Devanagari Extra" w:hAnsi="BRH Devanagari Extra" w:cs="BRH Devanagari Extra"/>
+                <w:color w:val="000000"/>
+                <w:sz w:val="40"/>
+                <w:szCs w:val="40"/>
+                <w:lang w:bidi="ml-IN"/>
+              </w:rPr>
+              <w:t>mÉëÌiÉþÌ¸irÉæ</w:t>
+            </w:r>
+            <w:proofErr w:type="spellEnd"/>
+            <w:r>
+              <w:rPr>
+                <w:rFonts w:ascii="BRH Devanagari Extra" w:hAnsi="BRH Devanagari Extra" w:cs="BRH Devanagari Extra"/>
+                <w:color w:val="000000"/>
+                <w:sz w:val="40"/>
+                <w:szCs w:val="40"/>
+                <w:lang w:bidi="ml-IN"/>
+              </w:rPr>
+              <w:t xml:space="preserve"> | </w:t>
             </w:r>
           </w:p>
           <w:p>
@@ -4307,6 +4850,7 @@
                 <w:szCs w:val="40"/>
               </w:rPr>
             </w:pPr>
+            <w:proofErr w:type="spellStart"/>
             <w:r>
               <w:rPr>
                 <w:rFonts w:ascii="BRH Devanagari Extra" w:hAnsi="BRH Devanagari Extra" w:cs="BRH Devanagari Extra"/>
@@ -4326,27 +4870,50 @@
                 <w:szCs w:val="40"/>
                 <w:lang w:bidi="ml-IN"/>
               </w:rPr>
-              <w:t>ëþÌiÉÌ¸irÉÉ A</w:t>
-            </w:r>
-            <w:r>
-              <w:rPr>
-                <w:rFonts w:ascii="BRH Malayalam Extra" w:hAnsi="BRH Malayalam Extra" w:cs="BRH Devanagari Extra"/>
-                <w:color w:val="000000"/>
-                <w:sz w:val="32"/>
-                <w:szCs w:val="40"/>
-                <w:lang w:bidi="ml-IN"/>
-              </w:rPr>
-              <w:t>–</w:t>
-            </w:r>
-            <w:r>
-              <w:rPr>
-                <w:rFonts w:ascii="BRH Devanagari Extra" w:hAnsi="BRH Devanagari Extra" w:cs="BRH Devanagari Extra"/>
-                <w:color w:val="000000"/>
-                <w:sz w:val="40"/>
-                <w:szCs w:val="40"/>
-                <w:lang w:bidi="ml-IN"/>
-              </w:rPr>
-              <w:t>ÎalÉÈ |</w:t>
+              <w:t>ëþÌiÉÌ¸irÉÉ</w:t>
+            </w:r>
+            <w:proofErr w:type="spellEnd"/>
+            <w:r>
+              <w:rPr>
+                <w:rFonts w:ascii="BRH Devanagari Extra" w:hAnsi="BRH Devanagari Extra" w:cs="BRH Devanagari Extra"/>
+                <w:color w:val="000000"/>
+                <w:sz w:val="40"/>
+                <w:szCs w:val="40"/>
+                <w:lang w:bidi="ml-IN"/>
+              </w:rPr>
+              <w:t xml:space="preserve"> A</w:t>
+            </w:r>
+            <w:r>
+              <w:rPr>
+                <w:rFonts w:ascii="BRH Malayalam Extra" w:hAnsi="BRH Malayalam Extra" w:cs="BRH Devanagari Extra"/>
+                <w:color w:val="000000"/>
+                <w:sz w:val="32"/>
+                <w:szCs w:val="40"/>
+                <w:lang w:bidi="ml-IN"/>
+              </w:rPr>
+              <w:t>–</w:t>
+            </w:r>
+            <w:proofErr w:type="spellStart"/>
+            <w:r>
+              <w:rPr>
+                <w:rFonts w:ascii="BRH Devanagari Extra" w:hAnsi="BRH Devanagari Extra" w:cs="BRH Devanagari Extra"/>
+                <w:color w:val="000000"/>
+                <w:sz w:val="40"/>
+                <w:szCs w:val="40"/>
+                <w:lang w:bidi="ml-IN"/>
+              </w:rPr>
+              <w:t>ÎalÉÈ</w:t>
+            </w:r>
+            <w:proofErr w:type="spellEnd"/>
+            <w:r>
+              <w:rPr>
+                <w:rFonts w:ascii="BRH Devanagari Extra" w:hAnsi="BRH Devanagari Extra" w:cs="BRH Devanagari Extra"/>
+                <w:color w:val="000000"/>
+                <w:sz w:val="40"/>
+                <w:szCs w:val="40"/>
+                <w:lang w:bidi="ml-IN"/>
+              </w:rPr>
+              <w:t xml:space="preserve"> |</w:t>
             </w:r>
           </w:p>
         </w:tc>
@@ -4397,7 +4964,51 @@
                 <w:szCs w:val="40"/>
                 <w:lang w:bidi="ml-IN"/>
               </w:rPr>
-              <w:t xml:space="preserve">¶ÉÉiÉç mÉëÌiÉþÌ¸irÉæ | </w:t>
+              <w:t>¶</w:t>
+            </w:r>
+            <w:proofErr w:type="spellStart"/>
+            <w:r>
+              <w:rPr>
+                <w:rFonts w:ascii="BRH Devanagari Extra" w:hAnsi="BRH Devanagari Extra" w:cs="BRH Devanagari Extra"/>
+                <w:color w:val="000000"/>
+                <w:sz w:val="40"/>
+                <w:szCs w:val="40"/>
+                <w:lang w:bidi="ml-IN"/>
+              </w:rPr>
+              <w:t>ÉÉiÉç</w:t>
+            </w:r>
+            <w:proofErr w:type="spellEnd"/>
+            <w:r>
+              <w:rPr>
+                <w:rFonts w:ascii="BRH Devanagari Extra" w:hAnsi="BRH Devanagari Extra" w:cs="BRH Devanagari Extra"/>
+                <w:color w:val="000000"/>
+                <w:sz w:val="40"/>
+                <w:szCs w:val="40"/>
+                <w:lang w:bidi="ml-IN"/>
+              </w:rPr>
+              <w:t xml:space="preserve"> </w:t>
+            </w:r>
+            <w:proofErr w:type="spellStart"/>
+            <w:r>
+              <w:rPr>
+                <w:rFonts w:ascii="BRH Devanagari Extra" w:hAnsi="BRH Devanagari Extra" w:cs="BRH Devanagari Extra"/>
+                <w:color w:val="000000"/>
+                <w:sz w:val="40"/>
+                <w:szCs w:val="40"/>
+                <w:lang w:bidi="ml-IN"/>
+              </w:rPr>
+              <w:t>mÉëÌiÉþÌ¸irÉæ</w:t>
+            </w:r>
+            <w:proofErr w:type="spellEnd"/>
+            <w:r>
+              <w:rPr>
+                <w:rFonts w:ascii="BRH Devanagari Extra" w:hAnsi="BRH Devanagari Extra" w:cs="BRH Devanagari Extra"/>
+                <w:color w:val="000000"/>
+                <w:sz w:val="40"/>
+                <w:szCs w:val="40"/>
+                <w:lang w:bidi="ml-IN"/>
+              </w:rPr>
+              <w:t xml:space="preserve"> | </w:t>
             </w:r>
           </w:p>
           <w:p>
@@ -4414,6 +5025,7 @@
                 <w:szCs w:val="40"/>
               </w:rPr>
             </w:pPr>
+            <w:proofErr w:type="spellStart"/>
             <w:r>
               <w:rPr>
                 <w:rFonts w:ascii="BRH Devanagari Extra" w:hAnsi="BRH Devanagari Extra" w:cs="BRH Devanagari Extra"/>
@@ -4453,27 +5065,50 @@
                 <w:szCs w:val="40"/>
                 <w:lang w:bidi="ml-IN"/>
               </w:rPr>
-              <w:t>Ì¸irÉÉ A</w:t>
-            </w:r>
-            <w:r>
-              <w:rPr>
-                <w:rFonts w:ascii="BRH Malayalam Extra" w:hAnsi="BRH Malayalam Extra" w:cs="BRH Devanagari Extra"/>
-                <w:color w:val="000000"/>
-                <w:sz w:val="32"/>
-                <w:szCs w:val="40"/>
-                <w:lang w:bidi="ml-IN"/>
-              </w:rPr>
-              <w:t>–</w:t>
-            </w:r>
-            <w:r>
-              <w:rPr>
-                <w:rFonts w:ascii="BRH Devanagari Extra" w:hAnsi="BRH Devanagari Extra" w:cs="BRH Devanagari Extra"/>
-                <w:color w:val="000000"/>
-                <w:sz w:val="40"/>
-                <w:szCs w:val="40"/>
-                <w:lang w:bidi="ml-IN"/>
-              </w:rPr>
-              <w:t>ÎalÉÈ |</w:t>
+              <w:t>Ì¸irÉÉ</w:t>
+            </w:r>
+            <w:proofErr w:type="spellEnd"/>
+            <w:r>
+              <w:rPr>
+                <w:rFonts w:ascii="BRH Devanagari Extra" w:hAnsi="BRH Devanagari Extra" w:cs="BRH Devanagari Extra"/>
+                <w:color w:val="000000"/>
+                <w:sz w:val="40"/>
+                <w:szCs w:val="40"/>
+                <w:lang w:bidi="ml-IN"/>
+              </w:rPr>
+              <w:t xml:space="preserve"> A</w:t>
+            </w:r>
+            <w:r>
+              <w:rPr>
+                <w:rFonts w:ascii="BRH Malayalam Extra" w:hAnsi="BRH Malayalam Extra" w:cs="BRH Devanagari Extra"/>
+                <w:color w:val="000000"/>
+                <w:sz w:val="32"/>
+                <w:szCs w:val="40"/>
+                <w:lang w:bidi="ml-IN"/>
+              </w:rPr>
+              <w:t>–</w:t>
+            </w:r>
+            <w:proofErr w:type="spellStart"/>
+            <w:r>
+              <w:rPr>
+                <w:rFonts w:ascii="BRH Devanagari Extra" w:hAnsi="BRH Devanagari Extra" w:cs="BRH Devanagari Extra"/>
+                <w:color w:val="000000"/>
+                <w:sz w:val="40"/>
+                <w:szCs w:val="40"/>
+                <w:lang w:bidi="ml-IN"/>
+              </w:rPr>
+              <w:t>ÎalÉÈ</w:t>
+            </w:r>
+            <w:proofErr w:type="spellEnd"/>
+            <w:r>
+              <w:rPr>
+                <w:rFonts w:ascii="BRH Devanagari Extra" w:hAnsi="BRH Devanagari Extra" w:cs="BRH Devanagari Extra"/>
+                <w:color w:val="000000"/>
+                <w:sz w:val="40"/>
+                <w:szCs w:val="40"/>
+                <w:lang w:bidi="ml-IN"/>
+              </w:rPr>
+              <w:t xml:space="preserve"> |</w:t>
             </w:r>
           </w:p>
         </w:tc>
@@ -4607,6 +5242,7 @@
                 <w:lang w:bidi="ml-IN"/>
               </w:rPr>
             </w:pPr>
+            <w:proofErr w:type="spellStart"/>
             <w:r>
               <w:rPr>
                 <w:rFonts w:ascii="BRH Devanagari Extra" w:hAnsi="BRH Devanagari Extra" w:cs="BRH Devanagari Extra"/>
@@ -4617,6 +5253,7 @@
               </w:rPr>
               <w:t>rÉÉ</w:t>
             </w:r>
+            <w:proofErr w:type="spellEnd"/>
             <w:r>
               <w:rPr>
                 <w:rFonts w:ascii="BRH Malayalam Extra" w:hAnsi="BRH Malayalam Extra" w:cs="BRH Devanagari Extra"/>
@@ -4667,6 +5304,7 @@
               </w:rPr>
               <w:t>–</w:t>
             </w:r>
+            <w:proofErr w:type="spellStart"/>
             <w:r>
               <w:rPr>
                 <w:rFonts w:ascii="BRH Devanagari Extra" w:hAnsi="BRH Devanagari Extra" w:cs="BRH Devanagari Extra"/>
@@ -4677,6 +5315,7 @@
               </w:rPr>
               <w:t>ÌiÉ</w:t>
             </w:r>
+            <w:proofErr w:type="spellEnd"/>
             <w:r>
               <w:rPr>
                 <w:rFonts w:ascii="BRH Malayalam Extra" w:hAnsi="BRH Malayalam Extra" w:cs="BRH Devanagari Extra"/>
@@ -4719,6 +5358,7 @@
               </w:rPr>
               <w:t>–</w:t>
             </w:r>
+            <w:proofErr w:type="spellStart"/>
             <w:r>
               <w:rPr>
                 <w:rFonts w:ascii="BRH Devanagari Extra" w:hAnsi="BRH Devanagari Extra" w:cs="BRH Devanagari Extra"/>
@@ -4738,7 +5378,18 @@
                 <w:szCs w:val="40"/>
                 <w:lang w:bidi="ml-IN"/>
               </w:rPr>
-              <w:t xml:space="preserve">¤ÉþxÉÉqÉç | </w:t>
+              <w:t>¤ÉþxÉÉqÉç</w:t>
+            </w:r>
+            <w:proofErr w:type="spellEnd"/>
+            <w:r>
+              <w:rPr>
+                <w:rFonts w:ascii="BRH Devanagari Extra" w:hAnsi="BRH Devanagari Extra" w:cs="BRH Devanagari Extra"/>
+                <w:color w:val="000000"/>
+                <w:sz w:val="40"/>
+                <w:szCs w:val="40"/>
+                <w:lang w:bidi="ml-IN"/>
+              </w:rPr>
+              <w:t xml:space="preserve"> | </w:t>
             </w:r>
           </w:p>
           <w:p>
@@ -4775,16 +5426,40 @@
               </w:rPr>
               <w:t>–</w:t>
             </w:r>
-            <w:r>
-              <w:rPr>
-                <w:rFonts w:ascii="BRH Devanagari Extra" w:hAnsi="BRH Devanagari Extra" w:cs="BRH Devanagari Extra"/>
-                <w:color w:val="000000"/>
-                <w:sz w:val="40"/>
-                <w:szCs w:val="40"/>
-                <w:lang w:bidi="ml-IN"/>
-              </w:rPr>
-              <w:t>cÉ¤ÉþxÉÉqÉç pÉÉ</w:t>
-            </w:r>
+            <w:proofErr w:type="spellStart"/>
+            <w:r>
+              <w:rPr>
+                <w:rFonts w:ascii="BRH Devanagari Extra" w:hAnsi="BRH Devanagari Extra" w:cs="BRH Devanagari Extra"/>
+                <w:color w:val="000000"/>
+                <w:sz w:val="40"/>
+                <w:szCs w:val="40"/>
+                <w:lang w:bidi="ml-IN"/>
+              </w:rPr>
+              <w:t>cÉ¤ÉþxÉÉqÉç</w:t>
+            </w:r>
+            <w:proofErr w:type="spellEnd"/>
+            <w:r>
+              <w:rPr>
+                <w:rFonts w:ascii="BRH Devanagari Extra" w:hAnsi="BRH Devanagari Extra" w:cs="BRH Devanagari Extra"/>
+                <w:color w:val="000000"/>
+                <w:sz w:val="40"/>
+                <w:szCs w:val="40"/>
+                <w:lang w:bidi="ml-IN"/>
+              </w:rPr>
+              <w:t xml:space="preserve"> </w:t>
+            </w:r>
+            <w:proofErr w:type="spellStart"/>
+            <w:r>
+              <w:rPr>
+                <w:rFonts w:ascii="BRH Devanagari Extra" w:hAnsi="BRH Devanagari Extra" w:cs="BRH Devanagari Extra"/>
+                <w:color w:val="000000"/>
+                <w:sz w:val="40"/>
+                <w:szCs w:val="40"/>
+                <w:lang w:bidi="ml-IN"/>
+              </w:rPr>
+              <w:t>pÉÉ</w:t>
+            </w:r>
+            <w:proofErr w:type="spellEnd"/>
             <w:r>
               <w:rPr>
                 <w:rFonts w:ascii="BRH Malayalam Extra" w:hAnsi="BRH Malayalam Extra" w:cs="BRH Devanagari Extra"/>
@@ -4826,6 +5501,7 @@
                 <w:lang w:bidi="ml-IN"/>
               </w:rPr>
             </w:pPr>
+            <w:proofErr w:type="spellStart"/>
             <w:r>
               <w:rPr>
                 <w:rFonts w:ascii="BRH Devanagari Extra" w:hAnsi="BRH Devanagari Extra" w:cs="BRH Devanagari Extra"/>
@@ -4836,6 +5512,7 @@
               </w:rPr>
               <w:t>rÉÉ</w:t>
             </w:r>
+            <w:proofErr w:type="spellEnd"/>
             <w:r>
               <w:rPr>
                 <w:rFonts w:ascii="BRH Malayalam Extra" w:hAnsi="BRH Malayalam Extra" w:cs="BRH Devanagari Extra"/>
@@ -4886,6 +5563,7 @@
               </w:rPr>
               <w:t>–</w:t>
             </w:r>
+            <w:proofErr w:type="spellStart"/>
             <w:r>
               <w:rPr>
                 <w:rFonts w:ascii="BRH Devanagari Extra" w:hAnsi="BRH Devanagari Extra" w:cs="BRH Devanagari Extra"/>
@@ -4896,6 +5574,7 @@
               </w:rPr>
               <w:t>ÌiÉ</w:t>
             </w:r>
+            <w:proofErr w:type="spellEnd"/>
             <w:r>
               <w:rPr>
                 <w:rFonts w:ascii="BRH Malayalam Extra" w:hAnsi="BRH Malayalam Extra" w:cs="BRH Devanagari Extra"/>
@@ -4926,6 +5605,7 @@
               </w:rPr>
               <w:t>–</w:t>
             </w:r>
+            <w:proofErr w:type="spellStart"/>
             <w:r>
               <w:rPr>
                 <w:rFonts w:ascii="BRH Devanagari Extra" w:hAnsi="BRH Devanagari Extra" w:cs="BRH Devanagari Extra"/>
@@ -4945,7 +5625,18 @@
                 <w:szCs w:val="40"/>
                 <w:lang w:bidi="ml-IN"/>
               </w:rPr>
-              <w:t xml:space="preserve">¤ÉþxÉÉqÉç | </w:t>
+              <w:t>¤ÉþxÉÉqÉç</w:t>
+            </w:r>
+            <w:proofErr w:type="spellEnd"/>
+            <w:r>
+              <w:rPr>
+                <w:rFonts w:ascii="BRH Devanagari Extra" w:hAnsi="BRH Devanagari Extra" w:cs="BRH Devanagari Extra"/>
+                <w:color w:val="000000"/>
+                <w:sz w:val="40"/>
+                <w:szCs w:val="40"/>
+                <w:lang w:bidi="ml-IN"/>
+              </w:rPr>
+              <w:t xml:space="preserve"> | </w:t>
             </w:r>
           </w:p>
           <w:p>
@@ -4982,16 +5673,40 @@
               </w:rPr>
               <w:t>–</w:t>
             </w:r>
-            <w:r>
-              <w:rPr>
-                <w:rFonts w:ascii="BRH Devanagari Extra" w:hAnsi="BRH Devanagari Extra" w:cs="BRH Devanagari Extra"/>
-                <w:color w:val="000000"/>
-                <w:sz w:val="40"/>
-                <w:szCs w:val="40"/>
-                <w:lang w:bidi="ml-IN"/>
-              </w:rPr>
-              <w:t>cÉ¤ÉþxÉÉqÉç pÉÉ</w:t>
-            </w:r>
+            <w:proofErr w:type="spellStart"/>
+            <w:r>
+              <w:rPr>
+                <w:rFonts w:ascii="BRH Devanagari Extra" w:hAnsi="BRH Devanagari Extra" w:cs="BRH Devanagari Extra"/>
+                <w:color w:val="000000"/>
+                <w:sz w:val="40"/>
+                <w:szCs w:val="40"/>
+                <w:lang w:bidi="ml-IN"/>
+              </w:rPr>
+              <w:t>cÉ¤ÉþxÉÉqÉç</w:t>
+            </w:r>
+            <w:proofErr w:type="spellEnd"/>
+            <w:r>
+              <w:rPr>
+                <w:rFonts w:ascii="BRH Devanagari Extra" w:hAnsi="BRH Devanagari Extra" w:cs="BRH Devanagari Extra"/>
+                <w:color w:val="000000"/>
+                <w:sz w:val="40"/>
+                <w:szCs w:val="40"/>
+                <w:lang w:bidi="ml-IN"/>
+              </w:rPr>
+              <w:t xml:space="preserve"> </w:t>
+            </w:r>
+            <w:proofErr w:type="spellStart"/>
+            <w:r>
+              <w:rPr>
+                <w:rFonts w:ascii="BRH Devanagari Extra" w:hAnsi="BRH Devanagari Extra" w:cs="BRH Devanagari Extra"/>
+                <w:color w:val="000000"/>
+                <w:sz w:val="40"/>
+                <w:szCs w:val="40"/>
+                <w:lang w:bidi="ml-IN"/>
+              </w:rPr>
+              <w:t>pÉÉ</w:t>
+            </w:r>
+            <w:proofErr w:type="spellEnd"/>
             <w:r>
               <w:rPr>
                 <w:rFonts w:ascii="BRH Malayalam Extra" w:hAnsi="BRH Malayalam Extra" w:cs="BRH Devanagari Extra"/>
@@ -5183,6 +5898,7 @@
               </w:rPr>
               <w:t>–</w:t>
             </w:r>
+            <w:proofErr w:type="spellStart"/>
             <w:r>
               <w:rPr>
                 <w:rFonts w:ascii="BRH Devanagari Extra" w:hAnsi="BRH Devanagari Extra" w:cs="BRH Devanagari Extra"/>
@@ -5204,6 +5920,7 @@
               </w:rPr>
               <w:t>É</w:t>
             </w:r>
+            <w:proofErr w:type="spellEnd"/>
             <w:r>
               <w:rPr>
                 <w:rFonts w:ascii="BRH Malayalam Extra" w:hAnsi="BRH Malayalam Extra" w:cs="BRH Devanagari Extra"/>
@@ -5254,6 +5971,7 @@
               </w:rPr>
               <w:t>–</w:t>
             </w:r>
+            <w:proofErr w:type="spellStart"/>
             <w:r>
               <w:rPr>
                 <w:rFonts w:ascii="BRH Devanagari Extra" w:hAnsi="BRH Devanagari Extra" w:cs="BRH Devanagari Extra"/>
@@ -5264,25 +5982,38 @@
               </w:rPr>
               <w:t>pÉÔ</w:t>
             </w:r>
-            <w:r>
-              <w:rPr>
-                <w:rFonts w:ascii="BRH Malayalam Extra" w:hAnsi="BRH Malayalam Extra" w:cs="BRH Devanagari Extra"/>
-                <w:color w:val="000000"/>
-                <w:sz w:val="32"/>
-                <w:szCs w:val="40"/>
-                <w:lang w:bidi="ml-IN"/>
-              </w:rPr>
-              <w:t>–</w:t>
-            </w:r>
-            <w:r>
-              <w:rPr>
-                <w:rFonts w:ascii="BRH Devanagari Extra" w:hAnsi="BRH Devanagari Extra" w:cs="BRH Devanagari Extra"/>
-                <w:color w:val="000000"/>
-                <w:sz w:val="40"/>
-                <w:szCs w:val="40"/>
-                <w:lang w:bidi="ml-IN"/>
-              </w:rPr>
-              <w:t>hÉÉqÉç |</w:t>
+            <w:proofErr w:type="spellEnd"/>
+            <w:r>
+              <w:rPr>
+                <w:rFonts w:ascii="BRH Malayalam Extra" w:hAnsi="BRH Malayalam Extra" w:cs="BRH Devanagari Extra"/>
+                <w:color w:val="000000"/>
+                <w:sz w:val="32"/>
+                <w:szCs w:val="40"/>
+                <w:lang w:bidi="ml-IN"/>
+              </w:rPr>
+              <w:t>–</w:t>
+            </w:r>
+            <w:proofErr w:type="spellStart"/>
+            <w:r>
+              <w:rPr>
+                <w:rFonts w:ascii="BRH Devanagari Extra" w:hAnsi="BRH Devanagari Extra" w:cs="BRH Devanagari Extra"/>
+                <w:color w:val="000000"/>
+                <w:sz w:val="40"/>
+                <w:szCs w:val="40"/>
+                <w:lang w:bidi="ml-IN"/>
+              </w:rPr>
+              <w:t>hÉÉqÉç</w:t>
+            </w:r>
+            <w:proofErr w:type="spellEnd"/>
+            <w:r>
+              <w:rPr>
+                <w:rFonts w:ascii="BRH Devanagari Extra" w:hAnsi="BRH Devanagari Extra" w:cs="BRH Devanagari Extra"/>
+                <w:color w:val="000000"/>
+                <w:sz w:val="40"/>
+                <w:szCs w:val="40"/>
+                <w:lang w:bidi="ml-IN"/>
+              </w:rPr>
+              <w:t xml:space="preserve"> |</w:t>
             </w:r>
           </w:p>
         </w:tc>
@@ -5403,6 +6134,7 @@
               </w:rPr>
               <w:t>–</w:t>
             </w:r>
+            <w:proofErr w:type="spellStart"/>
             <w:r>
               <w:rPr>
                 <w:rFonts w:ascii="BRH Devanagari Extra" w:hAnsi="BRH Devanagari Extra" w:cs="BRH Devanagari Extra"/>
@@ -5413,25 +6145,38 @@
               </w:rPr>
               <w:t>pÉÔ</w:t>
             </w:r>
-            <w:r>
-              <w:rPr>
-                <w:rFonts w:ascii="BRH Malayalam Extra" w:hAnsi="BRH Malayalam Extra" w:cs="BRH Devanagari Extra"/>
-                <w:color w:val="000000"/>
-                <w:sz w:val="32"/>
-                <w:szCs w:val="40"/>
-                <w:lang w:bidi="ml-IN"/>
-              </w:rPr>
-              <w:t>–</w:t>
-            </w:r>
-            <w:r>
-              <w:rPr>
-                <w:rFonts w:ascii="BRH Devanagari Extra" w:hAnsi="BRH Devanagari Extra" w:cs="BRH Devanagari Extra"/>
-                <w:color w:val="000000"/>
-                <w:sz w:val="40"/>
-                <w:szCs w:val="40"/>
-                <w:lang w:bidi="ml-IN"/>
-              </w:rPr>
-              <w:t>hÉÉqÉç |</w:t>
+            <w:proofErr w:type="spellEnd"/>
+            <w:r>
+              <w:rPr>
+                <w:rFonts w:ascii="BRH Malayalam Extra" w:hAnsi="BRH Malayalam Extra" w:cs="BRH Devanagari Extra"/>
+                <w:color w:val="000000"/>
+                <w:sz w:val="32"/>
+                <w:szCs w:val="40"/>
+                <w:lang w:bidi="ml-IN"/>
+              </w:rPr>
+              <w:t>–</w:t>
+            </w:r>
+            <w:proofErr w:type="spellStart"/>
+            <w:r>
+              <w:rPr>
+                <w:rFonts w:ascii="BRH Devanagari Extra" w:hAnsi="BRH Devanagari Extra" w:cs="BRH Devanagari Extra"/>
+                <w:color w:val="000000"/>
+                <w:sz w:val="40"/>
+                <w:szCs w:val="40"/>
+                <w:lang w:bidi="ml-IN"/>
+              </w:rPr>
+              <w:t>hÉÉqÉç</w:t>
+            </w:r>
+            <w:proofErr w:type="spellEnd"/>
+            <w:r>
+              <w:rPr>
+                <w:rFonts w:ascii="BRH Devanagari Extra" w:hAnsi="BRH Devanagari Extra" w:cs="BRH Devanagari Extra"/>
+                <w:color w:val="000000"/>
+                <w:sz w:val="40"/>
+                <w:szCs w:val="40"/>
+                <w:lang w:bidi="ml-IN"/>
+              </w:rPr>
+              <w:t xml:space="preserve"> |</w:t>
             </w:r>
           </w:p>
         </w:tc>
@@ -5592,8 +6337,31 @@
                 <w:szCs w:val="40"/>
                 <w:lang w:bidi="ml-IN"/>
               </w:rPr>
-              <w:t xml:space="preserve">¶ÉÉiÉç </w:t>
-            </w:r>
+              <w:t>¶</w:t>
+            </w:r>
+            <w:proofErr w:type="spellStart"/>
+            <w:r>
+              <w:rPr>
+                <w:rFonts w:ascii="BRH Devanagari Extra" w:hAnsi="BRH Devanagari Extra" w:cs="BRH Devanagari Extra"/>
+                <w:color w:val="000000"/>
+                <w:sz w:val="40"/>
+                <w:szCs w:val="40"/>
+                <w:lang w:bidi="ml-IN"/>
+              </w:rPr>
+              <w:t>ÉÉiÉç</w:t>
+            </w:r>
+            <w:proofErr w:type="spellEnd"/>
+            <w:r>
+              <w:rPr>
+                <w:rFonts w:ascii="BRH Devanagari Extra" w:hAnsi="BRH Devanagari Extra" w:cs="BRH Devanagari Extra"/>
+                <w:color w:val="000000"/>
+                <w:sz w:val="40"/>
+                <w:szCs w:val="40"/>
+                <w:lang w:bidi="ml-IN"/>
+              </w:rPr>
+              <w:t xml:space="preserve"> </w:t>
+            </w:r>
+            <w:proofErr w:type="spellStart"/>
             <w:r>
               <w:rPr>
                 <w:rFonts w:ascii="BRH Devanagari Extra" w:hAnsi="BRH Devanagari Extra" w:cs="BRH Devanagari Extra"/>
@@ -5605,6 +6373,7 @@
               </w:rPr>
               <w:t>mÉëÉ</w:t>
             </w:r>
+            <w:proofErr w:type="spellEnd"/>
             <w:r>
               <w:rPr>
                 <w:rFonts w:ascii="BRH Malayalam Extra" w:hAnsi="BRH Malayalam Extra" w:cs="BRH Devanagari Extra"/>
@@ -5616,35 +6385,71 @@
               </w:rPr>
               <w:t>–</w:t>
             </w:r>
-            <w:r>
-              <w:rPr>
-                <w:rFonts w:ascii="BRH Devanagari Extra" w:hAnsi="BRH Devanagari Extra" w:cs="BRH Devanagari Extra"/>
-                <w:color w:val="000000"/>
-                <w:sz w:val="40"/>
-                <w:szCs w:val="40"/>
-                <w:lang w:bidi="ml-IN"/>
-              </w:rPr>
-              <w:t>cÉÏÿqÉç | mÉëÉcÉÏþqÉÑ¨É</w:t>
-            </w:r>
-            <w:r>
-              <w:rPr>
-                <w:rFonts w:ascii="BRH Malayalam Extra" w:hAnsi="BRH Malayalam Extra" w:cs="BRH Devanagari Extra"/>
-                <w:color w:val="000000"/>
-                <w:sz w:val="32"/>
-                <w:szCs w:val="40"/>
-                <w:lang w:bidi="ml-IN"/>
-              </w:rPr>
-              <w:t>–</w:t>
-            </w:r>
-            <w:r>
-              <w:rPr>
-                <w:rFonts w:ascii="BRH Devanagari Extra" w:hAnsi="BRH Devanagari Extra" w:cs="BRH Devanagari Extra"/>
-                <w:color w:val="000000"/>
-                <w:sz w:val="40"/>
-                <w:szCs w:val="40"/>
-                <w:lang w:bidi="ml-IN"/>
-              </w:rPr>
-              <w:t>qÉÉqÉç |</w:t>
+            <w:proofErr w:type="spellStart"/>
+            <w:r>
+              <w:rPr>
+                <w:rFonts w:ascii="BRH Devanagari Extra" w:hAnsi="BRH Devanagari Extra" w:cs="BRH Devanagari Extra"/>
+                <w:color w:val="000000"/>
+                <w:sz w:val="40"/>
+                <w:szCs w:val="40"/>
+                <w:lang w:bidi="ml-IN"/>
+              </w:rPr>
+              <w:t>cÉÏÿqÉç</w:t>
+            </w:r>
+            <w:proofErr w:type="spellEnd"/>
+            <w:r>
+              <w:rPr>
+                <w:rFonts w:ascii="BRH Devanagari Extra" w:hAnsi="BRH Devanagari Extra" w:cs="BRH Devanagari Extra"/>
+                <w:color w:val="000000"/>
+                <w:sz w:val="40"/>
+                <w:szCs w:val="40"/>
+                <w:lang w:bidi="ml-IN"/>
+              </w:rPr>
+              <w:t xml:space="preserve"> | </w:t>
+            </w:r>
+            <w:proofErr w:type="spellStart"/>
+            <w:r>
+              <w:rPr>
+                <w:rFonts w:ascii="BRH Devanagari Extra" w:hAnsi="BRH Devanagari Extra" w:cs="BRH Devanagari Extra"/>
+                <w:color w:val="000000"/>
+                <w:sz w:val="40"/>
+                <w:szCs w:val="40"/>
+                <w:lang w:bidi="ml-IN"/>
+              </w:rPr>
+              <w:t>mÉëÉcÉÏþqÉÑ¨É</w:t>
+            </w:r>
+            <w:proofErr w:type="spellEnd"/>
+            <w:r>
+              <w:rPr>
+                <w:rFonts w:ascii="BRH Malayalam Extra" w:hAnsi="BRH Malayalam Extra" w:cs="BRH Devanagari Extra"/>
+                <w:color w:val="000000"/>
+                <w:sz w:val="32"/>
+                <w:szCs w:val="40"/>
+                <w:lang w:bidi="ml-IN"/>
+              </w:rPr>
+              <w:t>–</w:t>
+            </w:r>
+            <w:proofErr w:type="spellStart"/>
+            <w:r>
+              <w:rPr>
+                <w:rFonts w:ascii="BRH Devanagari Extra" w:hAnsi="BRH Devanagari Extra" w:cs="BRH Devanagari Extra"/>
+                <w:color w:val="000000"/>
+                <w:sz w:val="40"/>
+                <w:szCs w:val="40"/>
+                <w:lang w:bidi="ml-IN"/>
+              </w:rPr>
+              <w:t>qÉÉqÉç</w:t>
+            </w:r>
+            <w:proofErr w:type="spellEnd"/>
+            <w:r>
+              <w:rPr>
+                <w:rFonts w:ascii="BRH Devanagari Extra" w:hAnsi="BRH Devanagari Extra" w:cs="BRH Devanagari Extra"/>
+                <w:color w:val="000000"/>
+                <w:sz w:val="40"/>
+                <w:szCs w:val="40"/>
+                <w:lang w:bidi="ml-IN"/>
+              </w:rPr>
+              <w:t xml:space="preserve"> |</w:t>
             </w:r>
           </w:p>
         </w:tc>
@@ -5694,8 +6499,31 @@
                 <w:szCs w:val="40"/>
                 <w:lang w:bidi="ml-IN"/>
               </w:rPr>
-              <w:t xml:space="preserve">¶ÉÉiÉç </w:t>
-            </w:r>
+              <w:t>¶</w:t>
+            </w:r>
+            <w:proofErr w:type="spellStart"/>
+            <w:r>
+              <w:rPr>
+                <w:rFonts w:ascii="BRH Devanagari Extra" w:hAnsi="BRH Devanagari Extra" w:cs="BRH Devanagari Extra"/>
+                <w:color w:val="000000"/>
+                <w:sz w:val="40"/>
+                <w:szCs w:val="40"/>
+                <w:lang w:bidi="ml-IN"/>
+              </w:rPr>
+              <w:t>ÉÉiÉç</w:t>
+            </w:r>
+            <w:proofErr w:type="spellEnd"/>
+            <w:r>
+              <w:rPr>
+                <w:rFonts w:ascii="BRH Devanagari Extra" w:hAnsi="BRH Devanagari Extra" w:cs="BRH Devanagari Extra"/>
+                <w:color w:val="000000"/>
+                <w:sz w:val="40"/>
+                <w:szCs w:val="40"/>
+                <w:lang w:bidi="ml-IN"/>
+              </w:rPr>
+              <w:t xml:space="preserve"> </w:t>
+            </w:r>
+            <w:proofErr w:type="spellStart"/>
             <w:r>
               <w:rPr>
                 <w:rFonts w:ascii="BRH Devanagari Extra" w:hAnsi="BRH Devanagari Extra" w:cs="BRH Devanagari Extra"/>
@@ -5715,27 +6543,62 @@
                 <w:szCs w:val="40"/>
                 <w:lang w:bidi="ml-IN"/>
               </w:rPr>
-              <w:t>cÉÏÿqÉç | mÉëÉcÉÏþqÉÑ¨É</w:t>
-            </w:r>
-            <w:r>
-              <w:rPr>
-                <w:rFonts w:ascii="BRH Malayalam Extra" w:hAnsi="BRH Malayalam Extra" w:cs="BRH Devanagari Extra"/>
-                <w:color w:val="000000"/>
-                <w:sz w:val="32"/>
-                <w:szCs w:val="40"/>
-                <w:lang w:bidi="ml-IN"/>
-              </w:rPr>
-              <w:t>–</w:t>
-            </w:r>
-            <w:r>
-              <w:rPr>
-                <w:rFonts w:ascii="BRH Devanagari Extra" w:hAnsi="BRH Devanagari Extra" w:cs="BRH Devanagari Extra"/>
-                <w:color w:val="000000"/>
-                <w:sz w:val="40"/>
-                <w:szCs w:val="40"/>
-                <w:lang w:bidi="ml-IN"/>
-              </w:rPr>
-              <w:t>qÉÉqÉç |</w:t>
+              <w:t>cÉÏÿqÉç</w:t>
+            </w:r>
+            <w:proofErr w:type="spellEnd"/>
+            <w:r>
+              <w:rPr>
+                <w:rFonts w:ascii="BRH Devanagari Extra" w:hAnsi="BRH Devanagari Extra" w:cs="BRH Devanagari Extra"/>
+                <w:color w:val="000000"/>
+                <w:sz w:val="40"/>
+                <w:szCs w:val="40"/>
+                <w:lang w:bidi="ml-IN"/>
+              </w:rPr>
+              <w:t xml:space="preserve"> | </w:t>
+            </w:r>
+            <w:proofErr w:type="spellStart"/>
+            <w:r>
+              <w:rPr>
+                <w:rFonts w:ascii="BRH Devanagari Extra" w:hAnsi="BRH Devanagari Extra" w:cs="BRH Devanagari Extra"/>
+                <w:color w:val="000000"/>
+                <w:sz w:val="40"/>
+                <w:szCs w:val="40"/>
+                <w:lang w:bidi="ml-IN"/>
+              </w:rPr>
+              <w:t>mÉëÉcÉÏþqÉÑ¨É</w:t>
+            </w:r>
+            <w:proofErr w:type="spellEnd"/>
+            <w:r>
+              <w:rPr>
+                <w:rFonts w:ascii="BRH Malayalam Extra" w:hAnsi="BRH Malayalam Extra" w:cs="BRH Devanagari Extra"/>
+                <w:color w:val="000000"/>
+                <w:sz w:val="32"/>
+                <w:szCs w:val="40"/>
+                <w:lang w:bidi="ml-IN"/>
+              </w:rPr>
+              <w:t>–</w:t>
+            </w:r>
+            <w:proofErr w:type="spellStart"/>
+            <w:r>
+              <w:rPr>
+                <w:rFonts w:ascii="BRH Devanagari Extra" w:hAnsi="BRH Devanagari Extra" w:cs="BRH Devanagari Extra"/>
+                <w:color w:val="000000"/>
+                <w:sz w:val="40"/>
+                <w:szCs w:val="40"/>
+                <w:lang w:bidi="ml-IN"/>
+              </w:rPr>
+              <w:t>qÉÉqÉç</w:t>
+            </w:r>
+            <w:proofErr w:type="spellEnd"/>
+            <w:r>
+              <w:rPr>
+                <w:rFonts w:ascii="BRH Devanagari Extra" w:hAnsi="BRH Devanagari Extra" w:cs="BRH Devanagari Extra"/>
+                <w:color w:val="000000"/>
+                <w:sz w:val="40"/>
+                <w:szCs w:val="40"/>
+                <w:lang w:bidi="ml-IN"/>
+              </w:rPr>
+              <w:t xml:space="preserve"> |</w:t>
             </w:r>
           </w:p>
         </w:tc>
@@ -5773,6 +6636,7 @@
                 <w:sz w:val="28"/>
                 <w:szCs w:val="32"/>
               </w:rPr>
+              <w:lastRenderedPageBreak/>
               <w:t>T.S.5.3.7.4 – Kramam</w:t>
             </w:r>
           </w:p>
@@ -5869,6 +6733,7 @@
                 <w:lang w:val="en-IN" w:eastAsia="en-IN" w:bidi="ml-IN"/>
               </w:rPr>
             </w:pPr>
+            <w:proofErr w:type="spellStart"/>
             <w:r>
               <w:rPr>
                 <w:rFonts w:ascii="BRH Devanagari Extra" w:hAnsi="BRH Devanagari Extra" w:cs="BRH Devanagari Extra"/>
@@ -5900,36 +6765,60 @@
               </w:rPr>
               <w:t>þwOèrÉÉ</w:t>
             </w:r>
-            <w:r>
-              <w:rPr>
-                <w:rFonts w:ascii="BRH Malayalam Extra" w:hAnsi="BRH Malayalam Extra" w:cs="BRH Devanagari Extra"/>
-                <w:color w:val="000000"/>
-                <w:sz w:val="32"/>
-                <w:szCs w:val="40"/>
-                <w:lang w:bidi="ml-IN"/>
-              </w:rPr>
-              <w:t>–</w:t>
-            </w:r>
-            <w:r>
-              <w:rPr>
-                <w:rFonts w:ascii="BRH Devanagari Extra" w:hAnsi="BRH Devanagari Extra" w:cs="BRH Devanagari Extra"/>
-                <w:color w:val="000000"/>
-                <w:sz w:val="40"/>
-                <w:szCs w:val="40"/>
-                <w:lang w:bidi="ml-IN"/>
-              </w:rPr>
-              <w:t xml:space="preserve"> CirÉÑiÉç - xÉ×</w:t>
-            </w:r>
-            <w:r>
-              <w:rPr>
-                <w:rFonts w:ascii="BRH Malayalam Extra" w:hAnsi="BRH Malayalam Extra" w:cs="BRH Devanagari Extra"/>
-                <w:color w:val="000000"/>
-                <w:sz w:val="32"/>
-                <w:szCs w:val="40"/>
-                <w:lang w:bidi="ml-IN"/>
-              </w:rPr>
-              <w:t>–</w:t>
-            </w:r>
+            <w:proofErr w:type="spellEnd"/>
+            <w:r>
+              <w:rPr>
+                <w:rFonts w:ascii="BRH Malayalam Extra" w:hAnsi="BRH Malayalam Extra" w:cs="BRH Devanagari Extra"/>
+                <w:color w:val="000000"/>
+                <w:sz w:val="32"/>
+                <w:szCs w:val="40"/>
+                <w:lang w:bidi="ml-IN"/>
+              </w:rPr>
+              <w:t>–</w:t>
+            </w:r>
+            <w:r>
+              <w:rPr>
+                <w:rFonts w:ascii="BRH Devanagari Extra" w:hAnsi="BRH Devanagari Extra" w:cs="BRH Devanagari Extra"/>
+                <w:color w:val="000000"/>
+                <w:sz w:val="40"/>
+                <w:szCs w:val="40"/>
+                <w:lang w:bidi="ml-IN"/>
+              </w:rPr>
+              <w:t xml:space="preserve"> </w:t>
+            </w:r>
+            <w:proofErr w:type="spellStart"/>
+            <w:r>
+              <w:rPr>
+                <w:rFonts w:ascii="BRH Devanagari Extra" w:hAnsi="BRH Devanagari Extra" w:cs="BRH Devanagari Extra"/>
+                <w:color w:val="000000"/>
+                <w:sz w:val="40"/>
+                <w:szCs w:val="40"/>
+                <w:lang w:bidi="ml-IN"/>
+              </w:rPr>
+              <w:t>CirÉÑiÉç</w:t>
+            </w:r>
+            <w:proofErr w:type="spellEnd"/>
+            <w:r>
+              <w:rPr>
+                <w:rFonts w:ascii="BRH Devanagari Extra" w:hAnsi="BRH Devanagari Extra" w:cs="BRH Devanagari Extra"/>
+                <w:color w:val="000000"/>
+                <w:sz w:val="40"/>
+                <w:szCs w:val="40"/>
+                <w:lang w:bidi="ml-IN"/>
+              </w:rPr>
+              <w:t xml:space="preserve"> - xÉ×</w:t>
+            </w:r>
+            <w:r>
+              <w:rPr>
+                <w:rFonts w:ascii="BRH Malayalam Extra" w:hAnsi="BRH Malayalam Extra" w:cs="BRH Devanagari Extra"/>
+                <w:color w:val="000000"/>
+                <w:sz w:val="32"/>
+                <w:szCs w:val="40"/>
+                <w:lang w:bidi="ml-IN"/>
+              </w:rPr>
+              <w:t>–</w:t>
+            </w:r>
+            <w:proofErr w:type="spellStart"/>
             <w:r>
               <w:rPr>
                 <w:rFonts w:ascii="BRH Devanagari Extra" w:hAnsi="BRH Devanagari Extra" w:cs="BRH Devanagari Extra"/>
@@ -5940,6 +6829,7 @@
               </w:rPr>
               <w:t>wOèrÉæ</w:t>
             </w:r>
+            <w:proofErr w:type="spellEnd"/>
             <w:r>
               <w:rPr>
                 <w:rFonts w:ascii="BRH Malayalam Extra" w:hAnsi="BRH Malayalam Extra" w:cs="BRH Devanagari Extra"/>
@@ -5981,6 +6871,7 @@
                 <w:lang w:val="en-IN" w:eastAsia="en-IN" w:bidi="ml-IN"/>
               </w:rPr>
             </w:pPr>
+            <w:proofErr w:type="spellStart"/>
             <w:r>
               <w:rPr>
                 <w:rFonts w:ascii="BRH Devanagari Extra" w:hAnsi="BRH Devanagari Extra" w:cs="BRH Devanagari Extra"/>
@@ -6012,36 +6903,60 @@
               </w:rPr>
               <w:t>×þwOèrÉÉ</w:t>
             </w:r>
-            <w:r>
-              <w:rPr>
-                <w:rFonts w:ascii="BRH Malayalam Extra" w:hAnsi="BRH Malayalam Extra" w:cs="BRH Devanagari Extra"/>
-                <w:color w:val="000000"/>
-                <w:sz w:val="32"/>
-                <w:szCs w:val="40"/>
-                <w:lang w:bidi="ml-IN"/>
-              </w:rPr>
-              <w:t>–</w:t>
-            </w:r>
-            <w:r>
-              <w:rPr>
-                <w:rFonts w:ascii="BRH Devanagari Extra" w:hAnsi="BRH Devanagari Extra" w:cs="BRH Devanagari Extra"/>
-                <w:color w:val="000000"/>
-                <w:sz w:val="40"/>
-                <w:szCs w:val="40"/>
-                <w:lang w:bidi="ml-IN"/>
-              </w:rPr>
-              <w:t xml:space="preserve"> CirÉÑiÉç - xÉ×</w:t>
-            </w:r>
-            <w:r>
-              <w:rPr>
-                <w:rFonts w:ascii="BRH Malayalam Extra" w:hAnsi="BRH Malayalam Extra" w:cs="BRH Devanagari Extra"/>
-                <w:color w:val="000000"/>
-                <w:sz w:val="32"/>
-                <w:szCs w:val="40"/>
-                <w:lang w:bidi="ml-IN"/>
-              </w:rPr>
-              <w:t>–</w:t>
-            </w:r>
+            <w:proofErr w:type="spellEnd"/>
+            <w:r>
+              <w:rPr>
+                <w:rFonts w:ascii="BRH Malayalam Extra" w:hAnsi="BRH Malayalam Extra" w:cs="BRH Devanagari Extra"/>
+                <w:color w:val="000000"/>
+                <w:sz w:val="32"/>
+                <w:szCs w:val="40"/>
+                <w:lang w:bidi="ml-IN"/>
+              </w:rPr>
+              <w:t>–</w:t>
+            </w:r>
+            <w:r>
+              <w:rPr>
+                <w:rFonts w:ascii="BRH Devanagari Extra" w:hAnsi="BRH Devanagari Extra" w:cs="BRH Devanagari Extra"/>
+                <w:color w:val="000000"/>
+                <w:sz w:val="40"/>
+                <w:szCs w:val="40"/>
+                <w:lang w:bidi="ml-IN"/>
+              </w:rPr>
+              <w:t xml:space="preserve"> </w:t>
+            </w:r>
+            <w:proofErr w:type="spellStart"/>
+            <w:r>
+              <w:rPr>
+                <w:rFonts w:ascii="BRH Devanagari Extra" w:hAnsi="BRH Devanagari Extra" w:cs="BRH Devanagari Extra"/>
+                <w:color w:val="000000"/>
+                <w:sz w:val="40"/>
+                <w:szCs w:val="40"/>
+                <w:lang w:bidi="ml-IN"/>
+              </w:rPr>
+              <w:t>CirÉÑiÉç</w:t>
+            </w:r>
+            <w:proofErr w:type="spellEnd"/>
+            <w:r>
+              <w:rPr>
+                <w:rFonts w:ascii="BRH Devanagari Extra" w:hAnsi="BRH Devanagari Extra" w:cs="BRH Devanagari Extra"/>
+                <w:color w:val="000000"/>
+                <w:sz w:val="40"/>
+                <w:szCs w:val="40"/>
+                <w:lang w:bidi="ml-IN"/>
+              </w:rPr>
+              <w:t xml:space="preserve"> - xÉ×</w:t>
+            </w:r>
+            <w:r>
+              <w:rPr>
+                <w:rFonts w:ascii="BRH Malayalam Extra" w:hAnsi="BRH Malayalam Extra" w:cs="BRH Devanagari Extra"/>
+                <w:color w:val="000000"/>
+                <w:sz w:val="32"/>
+                <w:szCs w:val="40"/>
+                <w:lang w:bidi="ml-IN"/>
+              </w:rPr>
+              <w:t>–</w:t>
+            </w:r>
+            <w:proofErr w:type="spellStart"/>
             <w:r>
               <w:rPr>
                 <w:rFonts w:ascii="BRH Devanagari Extra" w:hAnsi="BRH Devanagari Extra" w:cs="BRH Devanagari Extra"/>
@@ -6052,6 +6967,7 @@
               </w:rPr>
               <w:t>wOèrÉæ</w:t>
             </w:r>
+            <w:proofErr w:type="spellEnd"/>
             <w:r>
               <w:rPr>
                 <w:rFonts w:ascii="BRH Malayalam Extra" w:hAnsi="BRH Malayalam Extra" w:cs="BRH Devanagari Extra"/>
@@ -6108,7 +7024,6 @@
                 <w:sz w:val="28"/>
                 <w:szCs w:val="32"/>
               </w:rPr>
-              <w:lastRenderedPageBreak/>
               <w:t>T.S.5.3.8.2 – Kramam</w:t>
             </w:r>
           </w:p>
@@ -6204,6 +7119,7 @@
                 <w:lang w:bidi="ml-IN"/>
               </w:rPr>
             </w:pPr>
+            <w:proofErr w:type="spellStart"/>
             <w:r>
               <w:rPr>
                 <w:rFonts w:ascii="BRH Devanagari Extra" w:hAnsi="BRH Devanagari Extra" w:cs="BRH Devanagari Extra"/>
@@ -6233,27 +7149,62 @@
                 <w:szCs w:val="40"/>
                 <w:lang w:bidi="ml-IN"/>
               </w:rPr>
-              <w:t>wOèrÉæ oÉ×Wû</w:t>
-            </w:r>
-            <w:r>
-              <w:rPr>
-                <w:rFonts w:ascii="BRH Malayalam Extra" w:hAnsi="BRH Malayalam Extra" w:cs="BRH Devanagari Extra"/>
-                <w:color w:val="000000"/>
-                <w:sz w:val="32"/>
-                <w:szCs w:val="40"/>
-                <w:lang w:bidi="ml-IN"/>
-              </w:rPr>
-              <w:t>–</w:t>
-            </w:r>
-            <w:r>
-              <w:rPr>
-                <w:rFonts w:ascii="BRH Devanagari Extra" w:hAnsi="BRH Devanagari Extra" w:cs="BRH Devanagari Extra"/>
-                <w:color w:val="000000"/>
-                <w:sz w:val="40"/>
-                <w:szCs w:val="40"/>
-                <w:lang w:bidi="ml-IN"/>
-              </w:rPr>
-              <w:t xml:space="preserve">iÉÏÈ | </w:t>
+              <w:t>wOèrÉæ</w:t>
+            </w:r>
+            <w:proofErr w:type="spellEnd"/>
+            <w:r>
+              <w:rPr>
+                <w:rFonts w:ascii="BRH Devanagari Extra" w:hAnsi="BRH Devanagari Extra" w:cs="BRH Devanagari Extra"/>
+                <w:color w:val="000000"/>
+                <w:sz w:val="40"/>
+                <w:szCs w:val="40"/>
+                <w:lang w:bidi="ml-IN"/>
+              </w:rPr>
+              <w:t xml:space="preserve"> </w:t>
+            </w:r>
+            <w:proofErr w:type="spellStart"/>
+            <w:r>
+              <w:rPr>
+                <w:rFonts w:ascii="BRH Devanagari Extra" w:hAnsi="BRH Devanagari Extra" w:cs="BRH Devanagari Extra"/>
+                <w:color w:val="000000"/>
+                <w:sz w:val="40"/>
+                <w:szCs w:val="40"/>
+                <w:lang w:bidi="ml-IN"/>
+              </w:rPr>
+              <w:t>oÉ×Wû</w:t>
+            </w:r>
+            <w:proofErr w:type="spellEnd"/>
+            <w:r>
+              <w:rPr>
+                <w:rFonts w:ascii="BRH Malayalam Extra" w:hAnsi="BRH Malayalam Extra" w:cs="BRH Devanagari Extra"/>
+                <w:color w:val="000000"/>
+                <w:sz w:val="32"/>
+                <w:szCs w:val="40"/>
+                <w:lang w:bidi="ml-IN"/>
+              </w:rPr>
+              <w:t>–</w:t>
+            </w:r>
+            <w:proofErr w:type="spellStart"/>
+            <w:r>
+              <w:rPr>
+                <w:rFonts w:ascii="BRH Devanagari Extra" w:hAnsi="BRH Devanagari Extra" w:cs="BRH Devanagari Extra"/>
+                <w:color w:val="000000"/>
+                <w:sz w:val="40"/>
+                <w:szCs w:val="40"/>
+                <w:lang w:bidi="ml-IN"/>
+              </w:rPr>
+              <w:t>iÉÏÈ</w:t>
+            </w:r>
+            <w:proofErr w:type="spellEnd"/>
+            <w:r>
+              <w:rPr>
+                <w:rFonts w:ascii="BRH Devanagari Extra" w:hAnsi="BRH Devanagari Extra" w:cs="BRH Devanagari Extra"/>
+                <w:color w:val="000000"/>
+                <w:sz w:val="40"/>
+                <w:szCs w:val="40"/>
+                <w:lang w:bidi="ml-IN"/>
+              </w:rPr>
+              <w:t xml:space="preserve"> | </w:t>
             </w:r>
           </w:p>
           <w:p>
@@ -6272,6 +7223,7 @@
                 <w:lang w:val="en-IN" w:eastAsia="en-IN" w:bidi="ml-IN"/>
               </w:rPr>
             </w:pPr>
+            <w:proofErr w:type="spellStart"/>
             <w:r>
               <w:rPr>
                 <w:rFonts w:ascii="BRH Devanagari Extra" w:hAnsi="BRH Devanagari Extra" w:cs="BRH Devanagari Extra"/>
@@ -6303,36 +7255,60 @@
               </w:rPr>
               <w:t>þwOèrÉÉ</w:t>
             </w:r>
-            <w:r>
-              <w:rPr>
-                <w:rFonts w:ascii="BRH Malayalam Extra" w:hAnsi="BRH Malayalam Extra" w:cs="BRH Devanagari Extra"/>
-                <w:color w:val="000000"/>
-                <w:sz w:val="32"/>
-                <w:szCs w:val="40"/>
-                <w:lang w:bidi="ml-IN"/>
-              </w:rPr>
-              <w:t>–</w:t>
-            </w:r>
-            <w:r>
-              <w:rPr>
-                <w:rFonts w:ascii="BRH Devanagari Extra" w:hAnsi="BRH Devanagari Extra" w:cs="BRH Devanagari Extra"/>
-                <w:color w:val="000000"/>
-                <w:sz w:val="40"/>
-                <w:szCs w:val="40"/>
-                <w:lang w:bidi="ml-IN"/>
-              </w:rPr>
-              <w:t xml:space="preserve"> CirÉÑiÉç - xÉ×</w:t>
-            </w:r>
-            <w:r>
-              <w:rPr>
-                <w:rFonts w:ascii="BRH Malayalam Extra" w:hAnsi="BRH Malayalam Extra" w:cs="BRH Devanagari Extra"/>
-                <w:color w:val="000000"/>
-                <w:sz w:val="32"/>
-                <w:szCs w:val="40"/>
-                <w:lang w:bidi="ml-IN"/>
-              </w:rPr>
-              <w:t>–</w:t>
-            </w:r>
+            <w:proofErr w:type="spellEnd"/>
+            <w:r>
+              <w:rPr>
+                <w:rFonts w:ascii="BRH Malayalam Extra" w:hAnsi="BRH Malayalam Extra" w:cs="BRH Devanagari Extra"/>
+                <w:color w:val="000000"/>
+                <w:sz w:val="32"/>
+                <w:szCs w:val="40"/>
+                <w:lang w:bidi="ml-IN"/>
+              </w:rPr>
+              <w:t>–</w:t>
+            </w:r>
+            <w:r>
+              <w:rPr>
+                <w:rFonts w:ascii="BRH Devanagari Extra" w:hAnsi="BRH Devanagari Extra" w:cs="BRH Devanagari Extra"/>
+                <w:color w:val="000000"/>
+                <w:sz w:val="40"/>
+                <w:szCs w:val="40"/>
+                <w:lang w:bidi="ml-IN"/>
+              </w:rPr>
+              <w:t xml:space="preserve"> </w:t>
+            </w:r>
+            <w:proofErr w:type="spellStart"/>
+            <w:r>
+              <w:rPr>
+                <w:rFonts w:ascii="BRH Devanagari Extra" w:hAnsi="BRH Devanagari Extra" w:cs="BRH Devanagari Extra"/>
+                <w:color w:val="000000"/>
+                <w:sz w:val="40"/>
+                <w:szCs w:val="40"/>
+                <w:lang w:bidi="ml-IN"/>
+              </w:rPr>
+              <w:t>CirÉÑiÉç</w:t>
+            </w:r>
+            <w:proofErr w:type="spellEnd"/>
+            <w:r>
+              <w:rPr>
+                <w:rFonts w:ascii="BRH Devanagari Extra" w:hAnsi="BRH Devanagari Extra" w:cs="BRH Devanagari Extra"/>
+                <w:color w:val="000000"/>
+                <w:sz w:val="40"/>
+                <w:szCs w:val="40"/>
+                <w:lang w:bidi="ml-IN"/>
+              </w:rPr>
+              <w:t xml:space="preserve"> - xÉ×</w:t>
+            </w:r>
+            <w:r>
+              <w:rPr>
+                <w:rFonts w:ascii="BRH Malayalam Extra" w:hAnsi="BRH Malayalam Extra" w:cs="BRH Devanagari Extra"/>
+                <w:color w:val="000000"/>
+                <w:sz w:val="32"/>
+                <w:szCs w:val="40"/>
+                <w:lang w:bidi="ml-IN"/>
+              </w:rPr>
+              <w:t>–</w:t>
+            </w:r>
+            <w:proofErr w:type="spellStart"/>
             <w:r>
               <w:rPr>
                 <w:rFonts w:ascii="BRH Devanagari Extra" w:hAnsi="BRH Devanagari Extra" w:cs="BRH Devanagari Extra"/>
@@ -6343,6 +7319,7 @@
               </w:rPr>
               <w:t>wOèrÉæ</w:t>
             </w:r>
+            <w:proofErr w:type="spellEnd"/>
             <w:r>
               <w:rPr>
                 <w:rFonts w:ascii="BRH Malayalam Extra" w:hAnsi="BRH Malayalam Extra" w:cs="BRH Devanagari Extra"/>
@@ -6385,6 +7362,7 @@
                 <w:lang w:bidi="ml-IN"/>
               </w:rPr>
             </w:pPr>
+            <w:proofErr w:type="spellStart"/>
             <w:r>
               <w:rPr>
                 <w:rFonts w:ascii="BRH Devanagari Extra" w:hAnsi="BRH Devanagari Extra" w:cs="BRH Devanagari Extra"/>
@@ -6414,27 +7392,62 @@
                 <w:szCs w:val="40"/>
                 <w:lang w:bidi="ml-IN"/>
               </w:rPr>
-              <w:t>wOèrÉæ oÉ×Wû</w:t>
-            </w:r>
-            <w:r>
-              <w:rPr>
-                <w:rFonts w:ascii="BRH Malayalam Extra" w:hAnsi="BRH Malayalam Extra" w:cs="BRH Devanagari Extra"/>
-                <w:color w:val="000000"/>
-                <w:sz w:val="32"/>
-                <w:szCs w:val="40"/>
-                <w:lang w:bidi="ml-IN"/>
-              </w:rPr>
-              <w:t>–</w:t>
-            </w:r>
-            <w:r>
-              <w:rPr>
-                <w:rFonts w:ascii="BRH Devanagari Extra" w:hAnsi="BRH Devanagari Extra" w:cs="BRH Devanagari Extra"/>
-                <w:color w:val="000000"/>
-                <w:sz w:val="40"/>
-                <w:szCs w:val="40"/>
-                <w:lang w:bidi="ml-IN"/>
-              </w:rPr>
-              <w:t xml:space="preserve">iÉÏÈ | </w:t>
+              <w:t>wOèrÉæ</w:t>
+            </w:r>
+            <w:proofErr w:type="spellEnd"/>
+            <w:r>
+              <w:rPr>
+                <w:rFonts w:ascii="BRH Devanagari Extra" w:hAnsi="BRH Devanagari Extra" w:cs="BRH Devanagari Extra"/>
+                <w:color w:val="000000"/>
+                <w:sz w:val="40"/>
+                <w:szCs w:val="40"/>
+                <w:lang w:bidi="ml-IN"/>
+              </w:rPr>
+              <w:t xml:space="preserve"> </w:t>
+            </w:r>
+            <w:proofErr w:type="spellStart"/>
+            <w:r>
+              <w:rPr>
+                <w:rFonts w:ascii="BRH Devanagari Extra" w:hAnsi="BRH Devanagari Extra" w:cs="BRH Devanagari Extra"/>
+                <w:color w:val="000000"/>
+                <w:sz w:val="40"/>
+                <w:szCs w:val="40"/>
+                <w:lang w:bidi="ml-IN"/>
+              </w:rPr>
+              <w:t>oÉ×Wû</w:t>
+            </w:r>
+            <w:proofErr w:type="spellEnd"/>
+            <w:r>
+              <w:rPr>
+                <w:rFonts w:ascii="BRH Malayalam Extra" w:hAnsi="BRH Malayalam Extra" w:cs="BRH Devanagari Extra"/>
+                <w:color w:val="000000"/>
+                <w:sz w:val="32"/>
+                <w:szCs w:val="40"/>
+                <w:lang w:bidi="ml-IN"/>
+              </w:rPr>
+              <w:t>–</w:t>
+            </w:r>
+            <w:proofErr w:type="spellStart"/>
+            <w:r>
+              <w:rPr>
+                <w:rFonts w:ascii="BRH Devanagari Extra" w:hAnsi="BRH Devanagari Extra" w:cs="BRH Devanagari Extra"/>
+                <w:color w:val="000000"/>
+                <w:sz w:val="40"/>
+                <w:szCs w:val="40"/>
+                <w:lang w:bidi="ml-IN"/>
+              </w:rPr>
+              <w:t>iÉÏÈ</w:t>
+            </w:r>
+            <w:proofErr w:type="spellEnd"/>
+            <w:r>
+              <w:rPr>
+                <w:rFonts w:ascii="BRH Devanagari Extra" w:hAnsi="BRH Devanagari Extra" w:cs="BRH Devanagari Extra"/>
+                <w:color w:val="000000"/>
+                <w:sz w:val="40"/>
+                <w:szCs w:val="40"/>
+                <w:lang w:bidi="ml-IN"/>
+              </w:rPr>
+              <w:t xml:space="preserve"> | </w:t>
             </w:r>
           </w:p>
           <w:p>
@@ -6453,6 +7466,7 @@
                 <w:lang w:val="en-IN" w:eastAsia="en-IN" w:bidi="ml-IN"/>
               </w:rPr>
             </w:pPr>
+            <w:proofErr w:type="spellStart"/>
             <w:r>
               <w:rPr>
                 <w:rFonts w:ascii="BRH Devanagari Extra" w:hAnsi="BRH Devanagari Extra" w:cs="BRH Devanagari Extra"/>
@@ -6484,36 +7498,60 @@
               </w:rPr>
               <w:t>þwOèrÉÉ</w:t>
             </w:r>
-            <w:r>
-              <w:rPr>
-                <w:rFonts w:ascii="BRH Malayalam Extra" w:hAnsi="BRH Malayalam Extra" w:cs="BRH Devanagari Extra"/>
-                <w:color w:val="000000"/>
-                <w:sz w:val="32"/>
-                <w:szCs w:val="40"/>
-                <w:lang w:bidi="ml-IN"/>
-              </w:rPr>
-              <w:t>–</w:t>
-            </w:r>
-            <w:r>
-              <w:rPr>
-                <w:rFonts w:ascii="BRH Devanagari Extra" w:hAnsi="BRH Devanagari Extra" w:cs="BRH Devanagari Extra"/>
-                <w:color w:val="000000"/>
-                <w:sz w:val="40"/>
-                <w:szCs w:val="40"/>
-                <w:lang w:bidi="ml-IN"/>
-              </w:rPr>
-              <w:t xml:space="preserve"> CirÉÑiÉç - xÉ×</w:t>
-            </w:r>
-            <w:r>
-              <w:rPr>
-                <w:rFonts w:ascii="BRH Malayalam Extra" w:hAnsi="BRH Malayalam Extra" w:cs="BRH Devanagari Extra"/>
-                <w:color w:val="000000"/>
-                <w:sz w:val="32"/>
-                <w:szCs w:val="40"/>
-                <w:lang w:bidi="ml-IN"/>
-              </w:rPr>
-              <w:t>–</w:t>
-            </w:r>
+            <w:proofErr w:type="spellEnd"/>
+            <w:r>
+              <w:rPr>
+                <w:rFonts w:ascii="BRH Malayalam Extra" w:hAnsi="BRH Malayalam Extra" w:cs="BRH Devanagari Extra"/>
+                <w:color w:val="000000"/>
+                <w:sz w:val="32"/>
+                <w:szCs w:val="40"/>
+                <w:lang w:bidi="ml-IN"/>
+              </w:rPr>
+              <w:t>–</w:t>
+            </w:r>
+            <w:r>
+              <w:rPr>
+                <w:rFonts w:ascii="BRH Devanagari Extra" w:hAnsi="BRH Devanagari Extra" w:cs="BRH Devanagari Extra"/>
+                <w:color w:val="000000"/>
+                <w:sz w:val="40"/>
+                <w:szCs w:val="40"/>
+                <w:lang w:bidi="ml-IN"/>
+              </w:rPr>
+              <w:t xml:space="preserve"> </w:t>
+            </w:r>
+            <w:proofErr w:type="spellStart"/>
+            <w:r>
+              <w:rPr>
+                <w:rFonts w:ascii="BRH Devanagari Extra" w:hAnsi="BRH Devanagari Extra" w:cs="BRH Devanagari Extra"/>
+                <w:color w:val="000000"/>
+                <w:sz w:val="40"/>
+                <w:szCs w:val="40"/>
+                <w:lang w:bidi="ml-IN"/>
+              </w:rPr>
+              <w:t>CirÉÑiÉç</w:t>
+            </w:r>
+            <w:proofErr w:type="spellEnd"/>
+            <w:r>
+              <w:rPr>
+                <w:rFonts w:ascii="BRH Devanagari Extra" w:hAnsi="BRH Devanagari Extra" w:cs="BRH Devanagari Extra"/>
+                <w:color w:val="000000"/>
+                <w:sz w:val="40"/>
+                <w:szCs w:val="40"/>
+                <w:lang w:bidi="ml-IN"/>
+              </w:rPr>
+              <w:t xml:space="preserve"> - xÉ×</w:t>
+            </w:r>
+            <w:r>
+              <w:rPr>
+                <w:rFonts w:ascii="BRH Malayalam Extra" w:hAnsi="BRH Malayalam Extra" w:cs="BRH Devanagari Extra"/>
+                <w:color w:val="000000"/>
+                <w:sz w:val="32"/>
+                <w:szCs w:val="40"/>
+                <w:lang w:bidi="ml-IN"/>
+              </w:rPr>
+              <w:t>–</w:t>
+            </w:r>
+            <w:proofErr w:type="spellStart"/>
             <w:r>
               <w:rPr>
                 <w:rFonts w:ascii="BRH Devanagari Extra" w:hAnsi="BRH Devanagari Extra" w:cs="BRH Devanagari Extra"/>
@@ -6524,6 +7562,7 @@
               </w:rPr>
               <w:t>wOèrÉæ</w:t>
             </w:r>
+            <w:proofErr w:type="spellEnd"/>
             <w:r>
               <w:rPr>
                 <w:rFonts w:ascii="BRH Malayalam Extra" w:hAnsi="BRH Malayalam Extra" w:cs="BRH Devanagari Extra"/>
@@ -6695,6 +7734,7 @@
               </w:rPr>
               <w:t>–</w:t>
             </w:r>
+            <w:proofErr w:type="spellStart"/>
             <w:r>
               <w:rPr>
                 <w:rFonts w:ascii="BRH Devanagari Extra" w:hAnsi="BRH Devanagari Extra" w:cs="BRH Devanagari Extra"/>
@@ -6705,16 +7745,18 @@
               </w:rPr>
               <w:t>lÉÑ</w:t>
             </w:r>
-            <w:r>
-              <w:rPr>
-                <w:rFonts w:ascii="BRH Malayalam Extra" w:hAnsi="BRH Malayalam Extra" w:cs="BRH Devanagari Extra"/>
-                <w:color w:val="000000"/>
-                <w:sz w:val="32"/>
-                <w:szCs w:val="40"/>
-                <w:lang w:bidi="ml-IN"/>
-              </w:rPr>
-              <w:t>–</w:t>
-            </w:r>
+            <w:proofErr w:type="spellEnd"/>
+            <w:r>
+              <w:rPr>
+                <w:rFonts w:ascii="BRH Malayalam Extra" w:hAnsi="BRH Malayalam Extra" w:cs="BRH Devanagari Extra"/>
+                <w:color w:val="000000"/>
+                <w:sz w:val="32"/>
+                <w:szCs w:val="40"/>
+                <w:lang w:bidi="ml-IN"/>
+              </w:rPr>
+              <w:t>–</w:t>
+            </w:r>
+            <w:proofErr w:type="spellStart"/>
             <w:r>
               <w:rPr>
                 <w:rFonts w:ascii="BRH Devanagari Extra" w:hAnsi="BRH Devanagari Extra" w:cs="BRH Devanagari Extra"/>
@@ -6735,6 +7777,7 @@
               </w:rPr>
               <w:t>å</w:t>
             </w:r>
+            <w:proofErr w:type="spellEnd"/>
             <w:r>
               <w:rPr>
                 <w:rFonts w:ascii="BRH Malayalam Extra" w:hAnsi="BRH Malayalam Extra" w:cs="BRH Devanagari Extra"/>
@@ -6755,6 +7798,7 @@
               </w:rPr>
               <w:t xml:space="preserve"> lÉ | </w:t>
             </w:r>
+            <w:proofErr w:type="spellStart"/>
             <w:r>
               <w:rPr>
                 <w:rFonts w:ascii="BRH Devanagari Extra" w:hAnsi="BRH Devanagari Extra" w:cs="BRH Devanagari Extra"/>
@@ -6766,6 +7810,7 @@
               </w:rPr>
               <w:t>lÉÉ</w:t>
             </w:r>
+            <w:proofErr w:type="spellEnd"/>
             <w:r>
               <w:rPr>
                 <w:rFonts w:ascii="BRH Malayalam Extra" w:hAnsi="BRH Malayalam Extra" w:cs="BRH Devanagari Extra"/>
@@ -6777,15 +7822,27 @@
               </w:rPr>
               <w:t>–</w:t>
             </w:r>
-            <w:r>
-              <w:rPr>
-                <w:rFonts w:ascii="BRH Devanagari Extra" w:hAnsi="BRH Devanagari Extra" w:cs="BRH Devanagari Extra"/>
-                <w:color w:val="000000"/>
-                <w:sz w:val="40"/>
-                <w:szCs w:val="40"/>
-                <w:lang w:bidi="ml-IN"/>
-              </w:rPr>
-              <w:t>ÎalÉlÉÉÿ |</w:t>
+            <w:proofErr w:type="spellStart"/>
+            <w:r>
+              <w:rPr>
+                <w:rFonts w:ascii="BRH Devanagari Extra" w:hAnsi="BRH Devanagari Extra" w:cs="BRH Devanagari Extra"/>
+                <w:color w:val="000000"/>
+                <w:sz w:val="40"/>
+                <w:szCs w:val="40"/>
+                <w:lang w:bidi="ml-IN"/>
+              </w:rPr>
+              <w:t>ÎalÉlÉÉÿ</w:t>
+            </w:r>
+            <w:proofErr w:type="spellEnd"/>
+            <w:r>
+              <w:rPr>
+                <w:rFonts w:ascii="BRH Devanagari Extra" w:hAnsi="BRH Devanagari Extra" w:cs="BRH Devanagari Extra"/>
+                <w:color w:val="000000"/>
+                <w:sz w:val="40"/>
+                <w:szCs w:val="40"/>
+                <w:lang w:bidi="ml-IN"/>
+              </w:rPr>
+              <w:t xml:space="preserve"> |</w:t>
             </w:r>
           </w:p>
         </w:tc>
@@ -6827,6 +7884,7 @@
               </w:rPr>
               <w:t>–</w:t>
             </w:r>
+            <w:proofErr w:type="spellStart"/>
             <w:r>
               <w:rPr>
                 <w:rFonts w:ascii="BRH Devanagari Extra" w:hAnsi="BRH Devanagari Extra" w:cs="BRH Devanagari Extra"/>
@@ -6837,16 +7895,18 @@
               </w:rPr>
               <w:t>lÉÑ</w:t>
             </w:r>
-            <w:r>
-              <w:rPr>
-                <w:rFonts w:ascii="BRH Malayalam Extra" w:hAnsi="BRH Malayalam Extra" w:cs="BRH Devanagari Extra"/>
-                <w:color w:val="000000"/>
-                <w:sz w:val="32"/>
-                <w:szCs w:val="40"/>
-                <w:lang w:bidi="ml-IN"/>
-              </w:rPr>
-              <w:t>–</w:t>
-            </w:r>
+            <w:proofErr w:type="spellEnd"/>
+            <w:r>
+              <w:rPr>
+                <w:rFonts w:ascii="BRH Malayalam Extra" w:hAnsi="BRH Malayalam Extra" w:cs="BRH Devanagari Extra"/>
+                <w:color w:val="000000"/>
+                <w:sz w:val="32"/>
+                <w:szCs w:val="40"/>
+                <w:lang w:bidi="ml-IN"/>
+              </w:rPr>
+              <w:t>–</w:t>
+            </w:r>
+            <w:proofErr w:type="spellStart"/>
             <w:r>
               <w:rPr>
                 <w:rFonts w:ascii="BRH Devanagari Extra" w:hAnsi="BRH Devanagari Extra" w:cs="BRH Devanagari Extra"/>
@@ -6867,6 +7927,7 @@
               </w:rPr>
               <w:t>å</w:t>
             </w:r>
+            <w:proofErr w:type="spellEnd"/>
             <w:r>
               <w:rPr>
                 <w:rFonts w:ascii="BRH Malayalam Extra" w:hAnsi="BRH Malayalam Extra" w:cs="BRH Devanagari Extra"/>
@@ -6887,6 +7948,7 @@
               </w:rPr>
               <w:t xml:space="preserve"> lÉ | </w:t>
             </w:r>
+            <w:proofErr w:type="spellStart"/>
             <w:r>
               <w:rPr>
                 <w:rFonts w:ascii="BRH Devanagari Extra" w:hAnsi="BRH Devanagari Extra" w:cs="BRH Devanagari Extra"/>
@@ -6906,7 +7968,18 @@
                 <w:szCs w:val="40"/>
                 <w:lang w:bidi="ml-IN"/>
               </w:rPr>
-              <w:t>ÎalÉlÉÉÿ |</w:t>
+              <w:t>ÎalÉlÉÉÿ</w:t>
+            </w:r>
+            <w:proofErr w:type="spellEnd"/>
+            <w:r>
+              <w:rPr>
+                <w:rFonts w:ascii="BRH Devanagari Extra" w:hAnsi="BRH Devanagari Extra" w:cs="BRH Devanagari Extra"/>
+                <w:color w:val="000000"/>
+                <w:sz w:val="40"/>
+                <w:szCs w:val="40"/>
+                <w:lang w:bidi="ml-IN"/>
+              </w:rPr>
+              <w:t xml:space="preserve"> |</w:t>
             </w:r>
           </w:p>
         </w:tc>
@@ -7059,6 +8132,7 @@
               </w:rPr>
               <w:t>–</w:t>
             </w:r>
+            <w:proofErr w:type="spellStart"/>
             <w:r>
               <w:rPr>
                 <w:rFonts w:ascii="BRH Devanagari Extra" w:hAnsi="BRH Devanagari Extra" w:cs="BRH Devanagari Extra"/>
@@ -7069,6 +8143,7 @@
               </w:rPr>
               <w:t>ÎxqÉ</w:t>
             </w:r>
+            <w:proofErr w:type="spellEnd"/>
             <w:r>
               <w:rPr>
                 <w:rFonts w:ascii="BRH Malayalam Extra" w:hAnsi="BRH Malayalam Extra" w:cs="BRH Devanagari Extra"/>
@@ -7111,15 +8186,27 @@
               </w:rPr>
               <w:t>–</w:t>
             </w:r>
-            <w:r>
-              <w:rPr>
-                <w:rFonts w:ascii="BRH Devanagari Extra" w:hAnsi="BRH Devanagari Extra" w:cs="BRH Devanagari Extra"/>
-                <w:color w:val="000000"/>
-                <w:sz w:val="40"/>
-                <w:szCs w:val="40"/>
-                <w:lang w:bidi="ml-IN"/>
-              </w:rPr>
-              <w:t>irÉÈ | AÉ</w:t>
+            <w:proofErr w:type="spellStart"/>
+            <w:r>
+              <w:rPr>
+                <w:rFonts w:ascii="BRH Devanagari Extra" w:hAnsi="BRH Devanagari Extra" w:cs="BRH Devanagari Extra"/>
+                <w:color w:val="000000"/>
+                <w:sz w:val="40"/>
+                <w:szCs w:val="40"/>
+                <w:lang w:bidi="ml-IN"/>
+              </w:rPr>
+              <w:t>irÉÈ</w:t>
+            </w:r>
+            <w:proofErr w:type="spellEnd"/>
+            <w:r>
+              <w:rPr>
+                <w:rFonts w:ascii="BRH Devanagari Extra" w:hAnsi="BRH Devanagari Extra" w:cs="BRH Devanagari Extra"/>
+                <w:color w:val="000000"/>
+                <w:sz w:val="40"/>
+                <w:szCs w:val="40"/>
+                <w:lang w:bidi="ml-IN"/>
+              </w:rPr>
+              <w:t xml:space="preserve"> | AÉ</w:t>
             </w:r>
             <w:r>
               <w:rPr>
@@ -7151,6 +8238,7 @@
               </w:rPr>
               <w:t>–</w:t>
             </w:r>
+            <w:proofErr w:type="spellStart"/>
             <w:r>
               <w:rPr>
                 <w:rFonts w:ascii="BRH Devanagari Extra" w:hAnsi="BRH Devanagari Extra" w:cs="BRH Devanagari Extra"/>
@@ -7171,15 +8259,38 @@
               </w:rPr>
               <w:t>å</w:t>
             </w:r>
-            <w:r>
-              <w:rPr>
-                <w:rFonts w:ascii="BRH Devanagari Extra" w:hAnsi="BRH Devanagari Extra" w:cs="BRH Devanagari Extra"/>
-                <w:color w:val="000000"/>
-                <w:sz w:val="40"/>
-                <w:szCs w:val="40"/>
-                <w:lang w:bidi="ml-IN"/>
-              </w:rPr>
-              <w:t xml:space="preserve"> ÂcÉÿqÉç |</w:t>
+            <w:proofErr w:type="spellEnd"/>
+            <w:r>
+              <w:rPr>
+                <w:rFonts w:ascii="BRH Devanagari Extra" w:hAnsi="BRH Devanagari Extra" w:cs="BRH Devanagari Extra"/>
+                <w:color w:val="000000"/>
+                <w:sz w:val="40"/>
+                <w:szCs w:val="40"/>
+                <w:lang w:bidi="ml-IN"/>
+              </w:rPr>
+              <w:t xml:space="preserve"> </w:t>
+            </w:r>
+            <w:proofErr w:type="spellStart"/>
+            <w:r>
+              <w:rPr>
+                <w:rFonts w:ascii="BRH Devanagari Extra" w:hAnsi="BRH Devanagari Extra" w:cs="BRH Devanagari Extra"/>
+                <w:color w:val="000000"/>
+                <w:sz w:val="40"/>
+                <w:szCs w:val="40"/>
+                <w:lang w:bidi="ml-IN"/>
+              </w:rPr>
+              <w:t>ÂcÉÿqÉç</w:t>
+            </w:r>
+            <w:proofErr w:type="spellEnd"/>
+            <w:r>
+              <w:rPr>
+                <w:rFonts w:ascii="BRH Devanagari Extra" w:hAnsi="BRH Devanagari Extra" w:cs="BRH Devanagari Extra"/>
+                <w:color w:val="000000"/>
+                <w:sz w:val="40"/>
+                <w:szCs w:val="40"/>
+                <w:lang w:bidi="ml-IN"/>
+              </w:rPr>
+              <w:t xml:space="preserve"> |</w:t>
             </w:r>
           </w:p>
         </w:tc>
@@ -7221,6 +8332,7 @@
               </w:rPr>
               <w:t>–</w:t>
             </w:r>
+            <w:proofErr w:type="spellStart"/>
             <w:r>
               <w:rPr>
                 <w:rFonts w:ascii="BRH Devanagari Extra" w:hAnsi="BRH Devanagari Extra" w:cs="BRH Devanagari Extra"/>
@@ -7231,6 +8343,7 @@
               </w:rPr>
               <w:t>ÎxqÉ</w:t>
             </w:r>
+            <w:proofErr w:type="spellEnd"/>
             <w:r>
               <w:rPr>
                 <w:rFonts w:ascii="BRH Malayalam Extra" w:hAnsi="BRH Malayalam Extra" w:cs="BRH Devanagari Extra"/>
@@ -7282,15 +8395,27 @@
               </w:rPr>
               <w:t>–</w:t>
             </w:r>
-            <w:r>
-              <w:rPr>
-                <w:rFonts w:ascii="BRH Devanagari Extra" w:hAnsi="BRH Devanagari Extra" w:cs="BRH Devanagari Extra"/>
-                <w:color w:val="000000"/>
-                <w:sz w:val="40"/>
-                <w:szCs w:val="40"/>
-                <w:lang w:bidi="ml-IN"/>
-              </w:rPr>
-              <w:t>irÉÈ | AÉ</w:t>
+            <w:proofErr w:type="spellStart"/>
+            <w:r>
+              <w:rPr>
+                <w:rFonts w:ascii="BRH Devanagari Extra" w:hAnsi="BRH Devanagari Extra" w:cs="BRH Devanagari Extra"/>
+                <w:color w:val="000000"/>
+                <w:sz w:val="40"/>
+                <w:szCs w:val="40"/>
+                <w:lang w:bidi="ml-IN"/>
+              </w:rPr>
+              <w:t>irÉÈ</w:t>
+            </w:r>
+            <w:proofErr w:type="spellEnd"/>
+            <w:r>
+              <w:rPr>
+                <w:rFonts w:ascii="BRH Devanagari Extra" w:hAnsi="BRH Devanagari Extra" w:cs="BRH Devanagari Extra"/>
+                <w:color w:val="000000"/>
+                <w:sz w:val="40"/>
+                <w:szCs w:val="40"/>
+                <w:lang w:bidi="ml-IN"/>
+              </w:rPr>
+              <w:t xml:space="preserve"> | AÉ</w:t>
             </w:r>
             <w:r>
               <w:rPr>
@@ -7322,6 +8447,7 @@
               </w:rPr>
               <w:t>–</w:t>
             </w:r>
+            <w:proofErr w:type="spellStart"/>
             <w:r>
               <w:rPr>
                 <w:rFonts w:ascii="BRH Devanagari Extra" w:hAnsi="BRH Devanagari Extra" w:cs="BRH Devanagari Extra"/>
@@ -7342,15 +8468,38 @@
               </w:rPr>
               <w:t>å</w:t>
             </w:r>
-            <w:r>
-              <w:rPr>
-                <w:rFonts w:ascii="BRH Devanagari Extra" w:hAnsi="BRH Devanagari Extra" w:cs="BRH Devanagari Extra"/>
-                <w:color w:val="000000"/>
-                <w:sz w:val="40"/>
-                <w:szCs w:val="40"/>
-                <w:lang w:bidi="ml-IN"/>
-              </w:rPr>
-              <w:t xml:space="preserve"> ÂcÉÿqÉç |</w:t>
+            <w:proofErr w:type="spellEnd"/>
+            <w:r>
+              <w:rPr>
+                <w:rFonts w:ascii="BRH Devanagari Extra" w:hAnsi="BRH Devanagari Extra" w:cs="BRH Devanagari Extra"/>
+                <w:color w:val="000000"/>
+                <w:sz w:val="40"/>
+                <w:szCs w:val="40"/>
+                <w:lang w:bidi="ml-IN"/>
+              </w:rPr>
+              <w:t xml:space="preserve"> </w:t>
+            </w:r>
+            <w:proofErr w:type="spellStart"/>
+            <w:r>
+              <w:rPr>
+                <w:rFonts w:ascii="BRH Devanagari Extra" w:hAnsi="BRH Devanagari Extra" w:cs="BRH Devanagari Extra"/>
+                <w:color w:val="000000"/>
+                <w:sz w:val="40"/>
+                <w:szCs w:val="40"/>
+                <w:lang w:bidi="ml-IN"/>
+              </w:rPr>
+              <w:t>ÂcÉÿqÉç</w:t>
+            </w:r>
+            <w:proofErr w:type="spellEnd"/>
+            <w:r>
+              <w:rPr>
+                <w:rFonts w:ascii="BRH Devanagari Extra" w:hAnsi="BRH Devanagari Extra" w:cs="BRH Devanagari Extra"/>
+                <w:color w:val="000000"/>
+                <w:sz w:val="40"/>
+                <w:szCs w:val="40"/>
+                <w:lang w:bidi="ml-IN"/>
+              </w:rPr>
+              <w:t xml:space="preserve"> |</w:t>
             </w:r>
           </w:p>
         </w:tc>
@@ -7504,6 +8653,7 @@
               </w:rPr>
               <w:t>–</w:t>
             </w:r>
+            <w:proofErr w:type="spellStart"/>
             <w:r>
               <w:rPr>
                 <w:rFonts w:ascii="BRH Devanagari Extra" w:hAnsi="BRH Devanagari Extra" w:cs="BRH Devanagari Extra"/>
@@ -7515,6 +8665,7 @@
               </w:rPr>
               <w:t>alÉå</w:t>
             </w:r>
+            <w:proofErr w:type="spellEnd"/>
             <w:r>
               <w:rPr>
                 <w:rFonts w:ascii="BRH Malayalam Extra" w:hAnsi="BRH Malayalam Extra" w:cs="BRH Devanagari Extra"/>
@@ -7534,7 +8685,51 @@
                 <w:szCs w:val="40"/>
                 <w:lang w:bidi="ml-IN"/>
               </w:rPr>
-              <w:t xml:space="preserve"> CÌiÉþ | CirÉÉþWû |</w:t>
+              <w:t xml:space="preserve"> </w:t>
+            </w:r>
+            <w:proofErr w:type="spellStart"/>
+            <w:r>
+              <w:rPr>
+                <w:rFonts w:ascii="BRH Devanagari Extra" w:hAnsi="BRH Devanagari Extra" w:cs="BRH Devanagari Extra"/>
+                <w:color w:val="000000"/>
+                <w:sz w:val="40"/>
+                <w:szCs w:val="40"/>
+                <w:lang w:bidi="ml-IN"/>
+              </w:rPr>
+              <w:t>CÌiÉþ</w:t>
+            </w:r>
+            <w:proofErr w:type="spellEnd"/>
+            <w:r>
+              <w:rPr>
+                <w:rFonts w:ascii="BRH Devanagari Extra" w:hAnsi="BRH Devanagari Extra" w:cs="BRH Devanagari Extra"/>
+                <w:color w:val="000000"/>
+                <w:sz w:val="40"/>
+                <w:szCs w:val="40"/>
+                <w:lang w:bidi="ml-IN"/>
+              </w:rPr>
+              <w:t xml:space="preserve"> | </w:t>
+            </w:r>
+            <w:proofErr w:type="spellStart"/>
+            <w:r>
+              <w:rPr>
+                <w:rFonts w:ascii="BRH Devanagari Extra" w:hAnsi="BRH Devanagari Extra" w:cs="BRH Devanagari Extra"/>
+                <w:color w:val="000000"/>
+                <w:sz w:val="40"/>
+                <w:szCs w:val="40"/>
+                <w:lang w:bidi="ml-IN"/>
+              </w:rPr>
+              <w:t>CirÉÉþWû</w:t>
+            </w:r>
+            <w:proofErr w:type="spellEnd"/>
+            <w:r>
+              <w:rPr>
+                <w:rFonts w:ascii="BRH Devanagari Extra" w:hAnsi="BRH Devanagari Extra" w:cs="BRH Devanagari Extra"/>
+                <w:color w:val="000000"/>
+                <w:sz w:val="40"/>
+                <w:szCs w:val="40"/>
+                <w:lang w:bidi="ml-IN"/>
+              </w:rPr>
+              <w:t xml:space="preserve"> |</w:t>
             </w:r>
           </w:p>
         </w:tc>
@@ -7607,7 +8802,51 @@
                 <w:szCs w:val="40"/>
                 <w:lang w:bidi="ml-IN"/>
               </w:rPr>
-              <w:t xml:space="preserve"> CÌiÉþ | CirÉÉþWû |</w:t>
+              <w:t xml:space="preserve"> </w:t>
+            </w:r>
+            <w:proofErr w:type="spellStart"/>
+            <w:r>
+              <w:rPr>
+                <w:rFonts w:ascii="BRH Devanagari Extra" w:hAnsi="BRH Devanagari Extra" w:cs="BRH Devanagari Extra"/>
+                <w:color w:val="000000"/>
+                <w:sz w:val="40"/>
+                <w:szCs w:val="40"/>
+                <w:lang w:bidi="ml-IN"/>
+              </w:rPr>
+              <w:t>CÌiÉþ</w:t>
+            </w:r>
+            <w:proofErr w:type="spellEnd"/>
+            <w:r>
+              <w:rPr>
+                <w:rFonts w:ascii="BRH Devanagari Extra" w:hAnsi="BRH Devanagari Extra" w:cs="BRH Devanagari Extra"/>
+                <w:color w:val="000000"/>
+                <w:sz w:val="40"/>
+                <w:szCs w:val="40"/>
+                <w:lang w:bidi="ml-IN"/>
+              </w:rPr>
+              <w:t xml:space="preserve"> | </w:t>
+            </w:r>
+            <w:proofErr w:type="spellStart"/>
+            <w:r>
+              <w:rPr>
+                <w:rFonts w:ascii="BRH Devanagari Extra" w:hAnsi="BRH Devanagari Extra" w:cs="BRH Devanagari Extra"/>
+                <w:color w:val="000000"/>
+                <w:sz w:val="40"/>
+                <w:szCs w:val="40"/>
+                <w:lang w:bidi="ml-IN"/>
+              </w:rPr>
+              <w:t>CirÉÉþWû</w:t>
+            </w:r>
+            <w:proofErr w:type="spellEnd"/>
+            <w:r>
+              <w:rPr>
+                <w:rFonts w:ascii="BRH Devanagari Extra" w:hAnsi="BRH Devanagari Extra" w:cs="BRH Devanagari Extra"/>
+                <w:color w:val="000000"/>
+                <w:sz w:val="40"/>
+                <w:szCs w:val="40"/>
+                <w:lang w:bidi="ml-IN"/>
+              </w:rPr>
+              <w:t xml:space="preserve"> |</w:t>
             </w:r>
           </w:p>
         </w:tc>
@@ -7641,7 +8880,29 @@
           <w:szCs w:val="40"/>
           <w:lang w:val="en-IN" w:eastAsia="en-IN"/>
         </w:rPr>
-        <w:t xml:space="preserve">"zlÉ" </w:t>
+        <w:t>"</w:t>
+      </w:r>
+      <w:proofErr w:type="spellStart"/>
+      <w:r>
+        <w:rPr>
+          <w:rFonts w:ascii="BRH Devanagari" w:hAnsi="BRH Devanagari" w:cs="BRH Devanagari"/>
+          <w:color w:val="000000"/>
+          <w:sz w:val="40"/>
+          <w:szCs w:val="40"/>
+          <w:lang w:val="en-IN" w:eastAsia="en-IN"/>
+        </w:rPr>
+        <w:t>zlÉ</w:t>
+      </w:r>
+      <w:proofErr w:type="spellEnd"/>
+      <w:r>
+        <w:rPr>
+          <w:rFonts w:ascii="BRH Devanagari" w:hAnsi="BRH Devanagari" w:cs="BRH Devanagari"/>
+          <w:color w:val="000000"/>
+          <w:sz w:val="40"/>
+          <w:szCs w:val="40"/>
+          <w:lang w:val="en-IN" w:eastAsia="en-IN"/>
+        </w:rPr>
+        <w:t xml:space="preserve">" </w:t>
       </w:r>
       <w:r>
         <w:rPr>
@@ -7649,7 +8910,16 @@
           <w:bCs/>
           <w:sz w:val="32"/>
         </w:rPr>
-        <w:t>replaced with</w:t>
+        <w:t xml:space="preserve">replaced </w:t>
+      </w:r>
+      <w:proofErr w:type="gramStart"/>
+      <w:r>
+        <w:rPr>
+          <w:b/>
+          <w:bCs/>
+          <w:sz w:val="32"/>
+        </w:rPr>
+        <w:t>with</w:t>
       </w:r>
       <w:r>
         <w:rPr>
@@ -7671,6 +8941,8 @@
         </w:rPr>
         <w:t>"</w:t>
       </w:r>
+      <w:proofErr w:type="spellStart"/>
+      <w:proofErr w:type="gramEnd"/>
       <w:r>
         <w:rPr>
           <w:rFonts w:ascii="BRH Devanagari" w:hAnsi="BRH Devanagari" w:cs="BRH Devanagari"/>
@@ -7682,6 +8954,7 @@
         </w:rPr>
         <w:t>zgÉ</w:t>
       </w:r>
+      <w:proofErr w:type="spellEnd"/>
       <w:r>
         <w:rPr>
           <w:rFonts w:ascii="BRH Devanagari" w:hAnsi="BRH Devanagari" w:cs="BRH Devanagari"/>
@@ -7931,6 +9204,7 @@
                 <w:sz w:val="32"/>
                 <w:szCs w:val="32"/>
               </w:rPr>
+              <w:lastRenderedPageBreak/>
               <w:t>Section, Paragraph</w:t>
             </w:r>
           </w:p>
@@ -8102,7 +9376,6 @@
           <w:b/>
           <w:sz w:val="32"/>
         </w:rPr>
-        <w:lastRenderedPageBreak/>
         <w:t>===================</w:t>
       </w:r>
     </w:p>
@@ -8199,14 +9472,35 @@
         <w:bCs/>
       </w:rPr>
       <w:tab/>
-      <w:t xml:space="preserve">              v</w:t>
+      <w:t xml:space="preserve">              </w:t>
     </w:r>
     <w:r>
       <w:rPr>
         <w:b/>
         <w:bCs/>
       </w:rPr>
-      <w:t>edavms@gmail.com</w:t>
+      <w:t>www.</w:t>
+    </w:r>
+    <w:r>
+      <w:rPr>
+        <w:b/>
+        <w:bCs/>
+      </w:rPr>
+      <w:t>v</w:t>
+    </w:r>
+    <w:r>
+      <w:rPr>
+        <w:b/>
+        <w:bCs/>
+      </w:rPr>
+      <w:t>edavms</w:t>
+    </w:r>
+    <w:r>
+      <w:rPr>
+        <w:b/>
+        <w:bCs/>
+      </w:rPr>
+      <w:t>.in</w:t>
     </w:r>
     <w:r>
       <w:rPr>
@@ -8225,6 +9519,9 @@
     </w:r>
     <w:r>
       <w:tab/>
+    </w:r>
+    <w:r>
+      <w:t xml:space="preserve">            </w:t>
     </w:r>
     <w:r>
       <w:tab/>

</xml_diff>